<commit_message>
Teile 02 bis 08 geschrieben
Grundlegung und Entwurf: fachliche Grundlagen, Anforderungen, Machbarkeit,
Architektur, fachliches Modell, Datenhaltung, Technologieauswahl.

Teil 06 stellt das Klassenbild dem Begriffsmodell aus Teil 02 gegenueber. Der
Vergleich foerdert zwei echte Maengel zutage: die Lieferung ist im Programm gar
keine Klasse, sondern nur ein Vorgang ohne Spur, und der Leistungsnachweis
fehlt - die Anzahl der Einheiten haengt an der Abrechnung.

Ausserdem trugen fuenf Diagramme noch die schwaechere Layout-Engine, die
frueher schon ueberlappende Beschriftungen erzeugt hat. Pragma entfernt, mit
Graphviz neu gezeichnet.

Co-Authored-By: Claude Opus 5 <noreply@anthropic.com>
</commit_message>
<xml_diff>
--- a/GKVTransmitter/Information/dokumentation/01-Vision.docx
+++ b/GKVTransmitter/Information/dokumentation/01-Vision.docx
@@ -388,7 +388,7 @@
       </w:r>
     </w:p>
     <w:bookmarkEnd w:id="9"/>
-    <w:bookmarkStart w:id="10" w:name="X0b22bf6df29d4855adc13b37f033195bc669984"/>
+    <w:bookmarkStart w:id="12" w:name="X0b22bf6df29d4855adc13b37f033195bc669984"/>
     <w:p>
       <w:pPr>
         <w:pStyle w:val="Heading2"/>
@@ -942,6 +942,64 @@
           </w:p>
         </w:tc>
       </w:tr>
+      <w:tr>
+        <w:tc>
+          <w:tcPr/>
+          <w:p>
+            <w:pPr>
+              <w:pStyle w:val="Compact"/>
+            </w:pPr>
+            <w:r>
+              <w:rPr>
+                <w:lang w:val="de"/>
+              </w:rPr>
+              <w:t xml:space="preserve">8</w:t>
+            </w:r>
+          </w:p>
+        </w:tc>
+        <w:tc>
+          <w:tcPr/>
+          <w:p>
+            <w:pPr>
+              <w:pStyle w:val="Compact"/>
+            </w:pPr>
+            <w:r>
+              <w:rPr>
+                <w:b/>
+                <w:bCs/>
+                <w:lang w:val="de"/>
+              </w:rPr>
+              <w:t xml:space="preserve">Sich rechnen</w:t>
+            </w:r>
+            <w:r>
+              <w:rPr>
+                <w:lang w:val="de"/>
+              </w:rPr>
+              <w:t xml:space="preserve"> </w:t>
+            </w:r>
+            <w:r>
+              <w:rPr>
+                <w:lang w:val="de"/>
+              </w:rPr>
+              <w:t xml:space="preserve">— über die Jahre weniger kosten als der Anteil, den eine Abrechnungsstelle nimmt</w:t>
+            </w:r>
+          </w:p>
+        </w:tc>
+        <w:tc>
+          <w:tcPr/>
+          <w:p>
+            <w:pPr>
+              <w:pStyle w:val="Compact"/>
+            </w:pPr>
+            <w:r>
+              <w:rPr>
+                <w:lang w:val="de"/>
+              </w:rPr>
+              <w:t xml:space="preserve">Die Summe aus Gebühren und Pflegeaufwand bleibt unter diesem Anteil</w:t>
+            </w:r>
+          </w:p>
+        </w:tc>
+      </w:tr>
     </w:tbl>
     <w:p>
       <w:pPr>
@@ -984,6 +1042,53 @@
         <w:t xml:space="preserve">Gesundheitsdaten das Haus verlassen.</w:t>
       </w:r>
     </w:p>
+    <w:bookmarkStart w:id="10" w:name="der-finanzielle-punkt"/>
+    <w:p>
+      <w:pPr>
+        <w:pStyle w:val="Heading3"/>
+      </w:pPr>
+      <w:r>
+        <w:rPr>
+          <w:lang w:val="de"/>
+        </w:rPr>
+        <w:t xml:space="preserve">Der finanzielle Punkt</w:t>
+      </w:r>
+    </w:p>
+    <w:p>
+      <w:pPr>
+        <w:pStyle w:val="FirstParagraph"/>
+      </w:pPr>
+      <w:r>
+        <w:rPr>
+          <w:lang w:val="de"/>
+        </w:rPr>
+        <w:t xml:space="preserve">Punkt 8 ist kein Anhängsel, sondern die Bedingung, unter der das ganze Vorhaben</w:t>
+      </w:r>
+      <w:r>
+        <w:rPr>
+          <w:lang w:val="de"/>
+        </w:rPr>
+        <w:t xml:space="preserve"> </w:t>
+      </w:r>
+      <w:r>
+        <w:rPr>
+          <w:lang w:val="de"/>
+        </w:rPr>
+        <w:t xml:space="preserve">steht. Ein Programm, das funktioniert und trotzdem teurer ist als der Weg über</w:t>
+      </w:r>
+      <w:r>
+        <w:rPr>
+          <w:lang w:val="de"/>
+        </w:rPr>
+        <w:t xml:space="preserve"> </w:t>
+      </w:r>
+      <w:r>
+        <w:rPr>
+          <w:lang w:val="de"/>
+        </w:rPr>
+        <w:t xml:space="preserve">einen Dienstleister, hat sein Ziel verfehlt.</w:t>
+      </w:r>
+    </w:p>
     <w:p>
       <w:pPr>
         <w:pStyle w:val="BodyText"/>
@@ -992,173 +1097,7 @@
         <w:rPr>
           <w:lang w:val="de"/>
         </w:rPr>
-        <w:t xml:space="preserve">Nicht jeder dieser Punkte ist am Ende dieses Teils entschieden, und nicht jeder</w:t>
-      </w:r>
-      <w:r>
-        <w:rPr>
-          <w:lang w:val="de"/>
-        </w:rPr>
-        <w:t xml:space="preserve"> </w:t>
-      </w:r>
-      <w:r>
-        <w:rPr>
-          <w:lang w:val="de"/>
-        </w:rPr>
-        <w:t xml:space="preserve">ist allein durch Programmieren erreichbar — Punkt 4 hängt an Zulassungen, die</w:t>
-      </w:r>
-      <w:r>
-        <w:rPr>
-          <w:lang w:val="de"/>
-        </w:rPr>
-        <w:t xml:space="preserve"> </w:t>
-      </w:r>
-      <w:r>
-        <w:rPr>
-          <w:lang w:val="de"/>
-        </w:rPr>
-        <w:t xml:space="preserve">niemand schreiben kann. Das ist Gegenstand von Teil 04.</w:t>
-      </w:r>
-    </w:p>
-    <w:bookmarkEnd w:id="10"/>
-    <w:bookmarkStart w:id="11" w:name="ziel-dieses-teils"/>
-    <w:p>
-      <w:pPr>
-        <w:pStyle w:val="Heading2"/>
-      </w:pPr>
-      <w:r>
-        <w:rPr>
-          <w:lang w:val="de"/>
-        </w:rPr>
-        <w:t xml:space="preserve">Ziel dieses Teils</w:t>
-      </w:r>
-    </w:p>
-    <w:p>
-      <w:pPr>
-        <w:pStyle w:val="Compact"/>
-        <w:numPr>
-          <w:ilvl w:val="0"/>
-          <w:numId w:val="1001"/>
-        </w:numPr>
-      </w:pPr>
-      <w:r>
-        <w:rPr>
-          <w:lang w:val="de"/>
-        </w:rPr>
-        <w:t xml:space="preserve">Festlegen, was das Programm können soll — und ebenso wichtig, was nicht.</w:t>
-      </w:r>
-    </w:p>
-    <w:p>
-      <w:pPr>
-        <w:pStyle w:val="Compact"/>
-        <w:numPr>
-          <w:ilvl w:val="0"/>
-          <w:numId w:val="1001"/>
-        </w:numPr>
-      </w:pPr>
-      <w:r>
-        <w:rPr>
-          <w:lang w:val="de"/>
-        </w:rPr>
-        <w:t xml:space="preserve">Entscheiden, wie weit es tragen soll: ein Programm für einen Kursanbieter oder</w:t>
-      </w:r>
-      <w:r>
-        <w:rPr>
-          <w:lang w:val="de"/>
-        </w:rPr>
-        <w:t xml:space="preserve"> </w:t>
-      </w:r>
-      <w:r>
-        <w:rPr>
-          <w:lang w:val="de"/>
-        </w:rPr>
-        <w:t xml:space="preserve">eines für die Abrechnung mit gesetzlichen Kassen überhaupt.</w:t>
-      </w:r>
-    </w:p>
-    <w:p>
-      <w:pPr>
-        <w:pStyle w:val="Compact"/>
-        <w:numPr>
-          <w:ilvl w:val="0"/>
-          <w:numId w:val="1001"/>
-        </w:numPr>
-      </w:pPr>
-      <w:r>
-        <w:rPr>
-          <w:lang w:val="de"/>
-        </w:rPr>
-        <w:t xml:space="preserve">Ein erstes Bild der Fachlichkeit: welche Begriffe es gibt, wie sie</w:t>
-      </w:r>
-      <w:r>
-        <w:rPr>
-          <w:lang w:val="de"/>
-        </w:rPr>
-        <w:t xml:space="preserve"> </w:t>
-      </w:r>
-      <w:r>
-        <w:rPr>
-          <w:lang w:val="de"/>
-        </w:rPr>
-        <w:t xml:space="preserve">zusammenhängen, was von ihnen dauerhaft festgehalten werden muss.</w:t>
-      </w:r>
-    </w:p>
-    <w:bookmarkEnd w:id="11"/>
-    <w:bookmarkStart w:id="16" w:name="überlegungen"/>
-    <w:p>
-      <w:pPr>
-        <w:pStyle w:val="Heading2"/>
-      </w:pPr>
-      <w:r>
-        <w:rPr>
-          <w:lang w:val="de"/>
-        </w:rPr>
-        <w:t xml:space="preserve">Überlegungen</w:t>
-      </w:r>
-    </w:p>
-    <w:bookmarkStart w:id="12" w:name="was-der-eigentliche-wert-wäre"/>
-    <w:p>
-      <w:pPr>
-        <w:pStyle w:val="Heading3"/>
-      </w:pPr>
-      <w:r>
-        <w:rPr>
-          <w:lang w:val="de"/>
-        </w:rPr>
-        <w:t xml:space="preserve">Was der eigentliche Wert wäre</w:t>
-      </w:r>
-    </w:p>
-    <w:p>
-      <w:pPr>
-        <w:pStyle w:val="FirstParagraph"/>
-      </w:pPr>
-      <w:r>
-        <w:rPr>
-          <w:lang w:val="de"/>
-        </w:rPr>
-        <w:t xml:space="preserve">Der naheliegende Gedanke — ein Programm, das eine Datei erzeugt — ist richtig</w:t>
-      </w:r>
-      <w:r>
-        <w:rPr>
-          <w:lang w:val="de"/>
-        </w:rPr>
-        <w:t xml:space="preserve"> </w:t>
-      </w:r>
-      <w:r>
-        <w:rPr>
-          <w:lang w:val="de"/>
-        </w:rPr>
-        <w:t xml:space="preserve">und zu kurz gedacht. Eine Datei zu erzeugen ist der leichte Teil. Der schwere</w:t>
-      </w:r>
-      <w:r>
-        <w:rPr>
-          <w:lang w:val="de"/>
-        </w:rPr>
-        <w:t xml:space="preserve"> </w:t>
-      </w:r>
-      <w:r>
-        <w:rPr>
-          <w:lang w:val="de"/>
-        </w:rPr>
-        <w:t xml:space="preserve">ist, dass sie</w:t>
+        <w:t xml:space="preserve">Die beiden Wege haben</w:t>
       </w:r>
       <w:r>
         <w:rPr>
@@ -1172,1154 +1111,31 @@
           <w:bCs/>
           <w:lang w:val="de"/>
         </w:rPr>
-        <w:t xml:space="preserve">stimmt</w:t>
-      </w:r>
-      <w:r>
-        <w:rPr>
-          <w:lang w:val="de"/>
-        </w:rPr>
-        <w:t xml:space="preserve">.</w:t>
-      </w:r>
-    </w:p>
-    <w:p>
-      <w:pPr>
-        <w:pStyle w:val="BodyText"/>
-      </w:pPr>
-      <w:r>
-        <w:rPr>
-          <w:lang w:val="de"/>
-        </w:rPr>
-        <w:t xml:space="preserve">Eine Abrechnung, die formal fehlerfrei aussieht und einen falschen Schlüsselwert</w:t>
-      </w:r>
-      <w:r>
-        <w:rPr>
-          <w:lang w:val="de"/>
-        </w:rPr>
-        <w:t xml:space="preserve"> </w:t>
-      </w:r>
-      <w:r>
-        <w:rPr>
-          <w:lang w:val="de"/>
-        </w:rPr>
-        <w:t xml:space="preserve">enthält, wird angenommen, verarbeitet und zurückgewiesen — oft Wochen später.</w:t>
-      </w:r>
-      <w:r>
-        <w:rPr>
-          <w:lang w:val="de"/>
-        </w:rPr>
-        <w:t xml:space="preserve"> </w:t>
-      </w:r>
-      <w:r>
-        <w:rPr>
-          <w:b/>
-          <w:bCs/>
-          <w:lang w:val="de"/>
-        </w:rPr>
-        <w:t xml:space="preserve">Fehler in diesem Verfahren sind selten laut. Sie sind still und teuer.</w:t>
-      </w:r>
-    </w:p>
-    <w:p>
-      <w:pPr>
-        <w:pStyle w:val="BlockText"/>
-      </w:pPr>
-      <w:r>
-        <w:rPr>
-          <w:b/>
-          <w:bCs/>
-          <w:lang w:val="de"/>
-        </w:rPr>
-        <w:t xml:space="preserve">Der Leitgedanke des Projekts: nicht das Abrechnen ist schwer, sondern das</w:t>
-      </w:r>
-      <w:r>
-        <w:rPr>
-          <w:b/>
-          <w:bCs/>
-          <w:lang w:val="de"/>
-        </w:rPr>
-        <w:t xml:space="preserve"> </w:t>
-      </w:r>
-      <w:r>
-        <w:rPr>
-          <w:b/>
-          <w:bCs/>
-          <w:lang w:val="de"/>
-        </w:rPr>
-        <w:t xml:space="preserve">Richtigsein.</w:t>
-      </w:r>
-    </w:p>
-    <w:p>
-      <w:pPr>
-        <w:pStyle w:val="FirstParagraph"/>
-      </w:pPr>
-      <w:r>
-        <w:rPr>
-          <w:lang w:val="de"/>
-        </w:rPr>
-        <w:t xml:space="preserve">Daraus folgt die Festlegung, die den ganzen Aufbau prägt:</w:t>
-      </w:r>
-      <w:r>
-        <w:rPr>
-          <w:lang w:val="de"/>
-        </w:rPr>
-        <w:t xml:space="preserve"> </w:t>
-      </w:r>
-      <w:r>
-        <w:rPr>
-          <w:b/>
-          <w:bCs/>
-          <w:lang w:val="de"/>
-        </w:rPr>
-        <w:t xml:space="preserve">das Programm prüft,</w:t>
-      </w:r>
-      <w:r>
-        <w:rPr>
-          <w:b/>
-          <w:bCs/>
-          <w:lang w:val="de"/>
-        </w:rPr>
-        <w:t xml:space="preserve"> </w:t>
-      </w:r>
-      <w:r>
-        <w:rPr>
-          <w:b/>
-          <w:bCs/>
-          <w:lang w:val="de"/>
-        </w:rPr>
-        <w:t xml:space="preserve">bevor etwas das Haus verlässt</w:t>
-      </w:r>
-      <w:r>
-        <w:rPr>
-          <w:lang w:val="de"/>
-        </w:rPr>
-        <w:t xml:space="preserve"> </w:t>
-      </w:r>
-      <w:r>
-        <w:rPr>
-          <w:lang w:val="de"/>
-        </w:rPr>
-        <w:t xml:space="preserve">— nicht als Zusatzfunktion, sondern als Tor, an</w:t>
-      </w:r>
-      <w:r>
-        <w:rPr>
-          <w:lang w:val="de"/>
-        </w:rPr>
-        <w:t xml:space="preserve"> </w:t>
-      </w:r>
-      <w:r>
-        <w:rPr>
-          <w:lang w:val="de"/>
-        </w:rPr>
-        <w:t xml:space="preserve">dem jede Lieferung vorbeimuss.</w:t>
-      </w:r>
-    </w:p>
-    <w:bookmarkEnd w:id="12"/>
-    <w:bookmarkStart w:id="13" w:name="wie-weit-soll-es-tragen"/>
-    <w:p>
-      <w:pPr>
-        <w:pStyle w:val="Heading3"/>
-      </w:pPr>
-      <w:r>
-        <w:rPr>
-          <w:lang w:val="de"/>
-        </w:rPr>
-        <w:t xml:space="preserve">Wie weit soll es tragen</w:t>
-      </w:r>
-    </w:p>
-    <w:p>
-      <w:pPr>
-        <w:pStyle w:val="FirstParagraph"/>
-      </w:pPr>
-      <w:r>
-        <w:rPr>
-          <w:lang w:val="de"/>
-        </w:rPr>
-        <w:t xml:space="preserve">Man könnte das Programm auf Hebammenkurse zuschneiden. Das wäre die kleinere</w:t>
-      </w:r>
-      <w:r>
-        <w:rPr>
-          <w:lang w:val="de"/>
-        </w:rPr>
-        <w:t xml:space="preserve"> </w:t>
-      </w:r>
-      <w:r>
-        <w:rPr>
-          <w:lang w:val="de"/>
-        </w:rPr>
-        <w:t xml:space="preserve">Aufgabe und für den ersten Fall vollkommen ausreichend.</w:t>
-      </w:r>
-    </w:p>
-    <w:p>
-      <w:pPr>
-        <w:pStyle w:val="BodyText"/>
-      </w:pPr>
-      <w:r>
-        <w:rPr>
-          <w:lang w:val="de"/>
-        </w:rPr>
-        <w:t xml:space="preserve">Dagegen spricht ein Blick auf das Verfahren selbst:</w:t>
-      </w:r>
-      <w:r>
-        <w:rPr>
-          <w:lang w:val="de"/>
-        </w:rPr>
-        <w:t xml:space="preserve"> </w:t>
-      </w:r>
-      <w:r>
-        <w:rPr>
-          <w:b/>
-          <w:bCs/>
-          <w:lang w:val="de"/>
-        </w:rPr>
-        <w:t xml:space="preserve">fast alles daran ist nicht</w:t>
-      </w:r>
-      <w:r>
-        <w:rPr>
-          <w:b/>
-          <w:bCs/>
-          <w:lang w:val="de"/>
-        </w:rPr>
-        <w:t xml:space="preserve"> </w:t>
-      </w:r>
-      <w:r>
-        <w:rPr>
-          <w:b/>
-          <w:bCs/>
-          <w:lang w:val="de"/>
-        </w:rPr>
-        <w:t xml:space="preserve">leistungsspezifisch.</w:t>
-      </w:r>
-    </w:p>
-    <w:tbl>
-      <w:tblPr>
-        <w:tblStyle w:val="Table"/>
-        <w:tblW w:type="pct" w:w="5000"/>
-        <w:tblLayout w:type="fixed"/>
-        <w:tblLook w:firstRow="1" w:lastRow="0" w:firstColumn="0" w:lastColumn="0" w:noHBand="0" w:noVBand="0" w:val="0020"/>
-      </w:tblPr>
-      <w:tblGrid>
-        <w:gridCol w:w="3960"/>
-        <w:gridCol w:w="3960"/>
-      </w:tblGrid>
-      <w:tr>
-        <w:trPr>
-          <w:tblHeader w:val="on"/>
-        </w:trPr>
-        <w:tc>
-          <w:tcPr/>
-          <w:p>
-            <w:pPr>
-              <w:pStyle w:val="Compact"/>
-            </w:pPr>
-            <w:r>
-              <w:rPr>
-                <w:lang w:val="de"/>
-              </w:rPr>
-              <w:t xml:space="preserve">Bleibt über die Leistungsbereiche gleich</w:t>
-            </w:r>
-          </w:p>
-        </w:tc>
-        <w:tc>
-          <w:tcPr/>
-          <w:p>
-            <w:pPr>
-              <w:pStyle w:val="Compact"/>
-            </w:pPr>
-            <w:r>
-              <w:rPr>
-                <w:lang w:val="de"/>
-              </w:rPr>
-              <w:t xml:space="preserve">Wechselt je Leistungsbereich</w:t>
-            </w:r>
-          </w:p>
-        </w:tc>
-      </w:tr>
-      <w:tr>
-        <w:tc>
-          <w:tcPr/>
-          <w:p>
-            <w:pPr>
-              <w:pStyle w:val="Compact"/>
-            </w:pPr>
-            <w:r>
-              <w:rPr>
-                <w:lang w:val="de"/>
-              </w:rPr>
-              <w:t xml:space="preserve">Der Aufbau der Nachricht — Rahmen, Rechnungs-, Versicherten-, Leistungs- und Summenteile</w:t>
-            </w:r>
-          </w:p>
-        </w:tc>
-        <w:tc>
-          <w:tcPr/>
-          <w:p>
-            <w:pPr>
-              <w:pStyle w:val="Compact"/>
-            </w:pPr>
-            <w:r>
-              <w:rPr>
-                <w:lang w:val="de"/>
-              </w:rPr>
-              <w:t xml:space="preserve">Der Sammelgruppenschlüssel im Nachrichtenkopf</w:t>
-            </w:r>
-          </w:p>
-        </w:tc>
-      </w:tr>
-      <w:tr>
-        <w:tc>
-          <w:tcPr/>
-          <w:p>
-            <w:pPr>
-              <w:pStyle w:val="Compact"/>
-            </w:pPr>
-            <w:r>
-              <w:rPr>
-                <w:lang w:val="de"/>
-              </w:rPr>
-              <w:t xml:space="preserve">Die Beteiligten und ihre Institutionskennzeichen samt Prüfziffer</w:t>
-            </w:r>
-          </w:p>
-        </w:tc>
-        <w:tc>
-          <w:tcPr/>
-          <w:p>
-            <w:pPr>
-              <w:pStyle w:val="Compact"/>
-            </w:pPr>
-            <w:r>
-              <w:rPr>
-                <w:lang w:val="de"/>
-              </w:rPr>
-              <w:t xml:space="preserve">Der Abrechnungscode</w:t>
-            </w:r>
-          </w:p>
-        </w:tc>
-      </w:tr>
-      <w:tr>
-        <w:tc>
-          <w:tcPr/>
-          <w:p>
-            <w:pPr>
-              <w:pStyle w:val="Compact"/>
-            </w:pPr>
-            <w:r>
-              <w:rPr>
-                <w:lang w:val="de"/>
-              </w:rPr>
-              <w:t xml:space="preserve">Prüfung, Zählerführung, Summenbildung</w:t>
-            </w:r>
-          </w:p>
-        </w:tc>
-        <w:tc>
-          <w:tcPr/>
-          <w:p>
-            <w:pPr>
-              <w:pStyle w:val="Compact"/>
-            </w:pPr>
-            <w:r>
-              <w:rPr>
-                <w:lang w:val="de"/>
-              </w:rPr>
-              <w:t xml:space="preserve">Positionsnummern und Tarifkennzeichen</w:t>
-            </w:r>
-          </w:p>
-        </w:tc>
-      </w:tr>
-      <w:tr>
-        <w:tc>
-          <w:tcPr/>
-          <w:p>
-            <w:pPr>
-              <w:pStyle w:val="Compact"/>
-            </w:pPr>
-            <w:r>
-              <w:rPr>
-                <w:lang w:val="de"/>
-              </w:rPr>
-              <w:t xml:space="preserve">Lieferung, Zustellweg, Einordnung der Rückmeldung</w:t>
-            </w:r>
-          </w:p>
-        </w:tc>
-        <w:tc>
-          <w:tcPr/>
-          <w:p>
-            <w:pPr>
-              <w:pStyle w:val="Compact"/>
-            </w:pPr>
-            <w:r>
-              <w:rPr>
-                <w:lang w:val="de"/>
-              </w:rPr>
-              <w:t xml:space="preserve">Der Vertrag, aus dem sich die zulässigen Werte ergeben</w:t>
-            </w:r>
-          </w:p>
-        </w:tc>
-      </w:tr>
-    </w:tbl>
-    <w:p>
-      <w:pPr>
-        <w:pStyle w:val="BodyText"/>
-      </w:pPr>
-      <w:r>
-        <w:rPr>
-          <w:lang w:val="de"/>
-        </w:rPr>
-        <w:t xml:space="preserve">Die rechte Spalte ist kurz, und sie besteht ausschließlich aus</w:t>
-      </w:r>
-      <w:r>
-        <w:rPr>
-          <w:lang w:val="de"/>
-        </w:rPr>
-        <w:t xml:space="preserve"> </w:t>
-      </w:r>
-      <w:r>
-        <w:rPr>
-          <w:b/>
-          <w:bCs/>
-          <w:lang w:val="de"/>
-        </w:rPr>
-        <w:t xml:space="preserve">Werten</w:t>
-      </w:r>
-      <w:r>
-        <w:rPr>
-          <w:lang w:val="de"/>
-        </w:rPr>
-        <w:t xml:space="preserve">, nicht</w:t>
-      </w:r>
-      <w:r>
-        <w:rPr>
-          <w:lang w:val="de"/>
-        </w:rPr>
-        <w:t xml:space="preserve"> </w:t>
-      </w:r>
-      <w:r>
-        <w:rPr>
-          <w:lang w:val="de"/>
-        </w:rPr>
-        <w:t xml:space="preserve">aus Abläufen. Ein zweiter Leistungsbereich verlangt also Einträge, keinen Umbau</w:t>
-      </w:r>
-      <w:r>
-        <w:rPr>
-          <w:lang w:val="de"/>
-        </w:rPr>
-        <w:t xml:space="preserve"> </w:t>
-      </w:r>
-      <w:r>
-        <w:rPr>
-          <w:lang w:val="de"/>
-        </w:rPr>
-        <w:t xml:space="preserve">— vorausgesetzt, das Modell trennt beides von Anfang an.</w:t>
-      </w:r>
-    </w:p>
-    <w:p>
-      <w:pPr>
-        <w:pStyle w:val="BodyText"/>
-      </w:pPr>
-      <w:r>
-        <w:rPr>
-          <w:lang w:val="de"/>
-        </w:rPr>
-        <w:t xml:space="preserve">Genau das kostet in der Vision fast nichts und später sehr viel: ein Begriff,</w:t>
-      </w:r>
-      <w:r>
-        <w:rPr>
-          <w:lang w:val="de"/>
-        </w:rPr>
-        <w:t xml:space="preserve"> </w:t>
-      </w:r>
-      <w:r>
-        <w:rPr>
-          <w:lang w:val="de"/>
-        </w:rPr>
-        <w:t xml:space="preserve">der von Beginn an „Leistungsfall” heißt statt „Kurs”, trägt eine</w:t>
-      </w:r>
-      <w:r>
-        <w:rPr>
-          <w:lang w:val="de"/>
-        </w:rPr>
-        <w:t xml:space="preserve"> </w:t>
-      </w:r>
-      <w:r>
-        <w:rPr>
-          <w:lang w:val="de"/>
-        </w:rPr>
-        <w:t xml:space="preserve">Behandlungsserie mit, ohne dass jemand ihn umbenennen muss.</w:t>
-      </w:r>
-    </w:p>
-    <w:bookmarkEnd w:id="13"/>
-    <w:bookmarkStart w:id="14" w:name="wer-es-bedient"/>
-    <w:p>
-      <w:pPr>
-        <w:pStyle w:val="Heading3"/>
-      </w:pPr>
-      <w:r>
-        <w:rPr>
-          <w:lang w:val="de"/>
-        </w:rPr>
-        <w:t xml:space="preserve">Wer es bedient</w:t>
-      </w:r>
-    </w:p>
-    <w:p>
-      <w:pPr>
-        <w:pStyle w:val="FirstParagraph"/>
-      </w:pPr>
-      <w:r>
-        <w:rPr>
-          <w:lang w:val="de"/>
-        </w:rPr>
-        <w:t xml:space="preserve">Eine einzelne Person, an einem einzelnen Rechner, ohne besondere</w:t>
-      </w:r>
-      <w:r>
-        <w:rPr>
-          <w:lang w:val="de"/>
-        </w:rPr>
-        <w:t xml:space="preserve"> </w:t>
-      </w:r>
-      <w:r>
-        <w:rPr>
-          <w:lang w:val="de"/>
-        </w:rPr>
-        <w:t xml:space="preserve">Computerkenntnisse und ohne jemanden, der bei Problemen hilft. Meist abends,</w:t>
-      </w:r>
-      <w:r>
-        <w:rPr>
-          <w:lang w:val="de"/>
-        </w:rPr>
-        <w:t xml:space="preserve"> </w:t>
-      </w:r>
-      <w:r>
-        <w:rPr>
-          <w:lang w:val="de"/>
-        </w:rPr>
-        <w:t xml:space="preserve">nach der Arbeit.</w:t>
-      </w:r>
-    </w:p>
-    <w:tbl>
-      <w:tblPr>
-        <w:tblStyle w:val="Table"/>
-        <w:tblW w:type="pct" w:w="5000"/>
-        <w:tblLayout w:type="fixed"/>
-        <w:tblLook w:firstRow="1" w:lastRow="0" w:firstColumn="0" w:lastColumn="0" w:noHBand="0" w:noVBand="0" w:val="0020"/>
-      </w:tblPr>
-      <w:tblGrid>
-        <w:gridCol w:w="3960"/>
-        <w:gridCol w:w="3960"/>
-      </w:tblGrid>
-      <w:tr>
-        <w:trPr>
-          <w:tblHeader w:val="on"/>
-        </w:trPr>
-        <w:tc>
-          <w:tcPr/>
-          <w:p>
-            <w:pPr>
-              <w:pStyle w:val="Compact"/>
-            </w:pPr>
-            <w:r>
-              <w:rPr>
-                <w:lang w:val="de"/>
-              </w:rPr>
-              <w:t xml:space="preserve">Umstand</w:t>
-            </w:r>
-          </w:p>
-        </w:tc>
-        <w:tc>
-          <w:tcPr/>
-          <w:p>
-            <w:pPr>
-              <w:pStyle w:val="Compact"/>
-            </w:pPr>
-            <w:r>
-              <w:rPr>
-                <w:lang w:val="de"/>
-              </w:rPr>
-              <w:t xml:space="preserve">Was daraus für das Programm folgt</w:t>
-            </w:r>
-          </w:p>
-        </w:tc>
-      </w:tr>
-      <w:tr>
-        <w:tc>
-          <w:tcPr/>
-          <w:p>
-            <w:pPr>
-              <w:pStyle w:val="Compact"/>
-            </w:pPr>
-            <w:r>
-              <w:rPr>
-                <w:lang w:val="de"/>
-              </w:rPr>
-              <w:t xml:space="preserve">Niemand richtet etwas ein</w:t>
-            </w:r>
-          </w:p>
-        </w:tc>
-        <w:tc>
-          <w:tcPr/>
-          <w:p>
-            <w:pPr>
-              <w:pStyle w:val="Compact"/>
-            </w:pPr>
-            <w:r>
-              <w:rPr>
-                <w:lang w:val="de"/>
-              </w:rPr>
-              <w:t xml:space="preserve">Es darf</w:t>
-            </w:r>
-            <w:r>
-              <w:rPr>
-                <w:lang w:val="de"/>
-              </w:rPr>
-              <w:t xml:space="preserve"> </w:t>
-            </w:r>
-            <w:r>
-              <w:rPr>
-                <w:b/>
-                <w:bCs/>
-                <w:lang w:val="de"/>
-              </w:rPr>
-              <w:t xml:space="preserve">nichts zusätzlich installiert</w:t>
-            </w:r>
-            <w:r>
-              <w:rPr>
-                <w:lang w:val="de"/>
-              </w:rPr>
-              <w:t xml:space="preserve"> </w:t>
-            </w:r>
-            <w:r>
-              <w:rPr>
-                <w:lang w:val="de"/>
-              </w:rPr>
-              <w:t xml:space="preserve">werden müssen — keine Datenbank, keine Laufzeitumgebung, kein Serverdienst</w:t>
-            </w:r>
-          </w:p>
-        </w:tc>
-      </w:tr>
-      <w:tr>
-        <w:tc>
-          <w:tcPr/>
-          <w:p>
-            <w:pPr>
-              <w:pStyle w:val="Compact"/>
-            </w:pPr>
-            <w:r>
-              <w:rPr>
-                <w:lang w:val="de"/>
-              </w:rPr>
-              <w:t xml:space="preserve">Es geht um Gesundheitsdaten</w:t>
-            </w:r>
-          </w:p>
-        </w:tc>
-        <w:tc>
-          <w:tcPr/>
-          <w:p>
-            <w:pPr>
-              <w:pStyle w:val="Compact"/>
-            </w:pPr>
-            <w:r>
-              <w:rPr>
-                <w:lang w:val="de"/>
-              </w:rPr>
-              <w:t xml:space="preserve">Die Daten bleiben</w:t>
-            </w:r>
-            <w:r>
-              <w:rPr>
-                <w:lang w:val="de"/>
-              </w:rPr>
-              <w:t xml:space="preserve"> </w:t>
-            </w:r>
-            <w:r>
-              <w:rPr>
-                <w:b/>
-                <w:bCs/>
-                <w:lang w:val="de"/>
-              </w:rPr>
-              <w:t xml:space="preserve">auf dem Rechner der Anwenderin</w:t>
-            </w:r>
-            <w:r>
-              <w:rPr>
-                <w:lang w:val="de"/>
-              </w:rPr>
-              <w:t xml:space="preserve">, nicht im Netz</w:t>
-            </w:r>
-          </w:p>
-        </w:tc>
-      </w:tr>
-      <w:tr>
-        <w:tc>
-          <w:tcPr/>
-          <w:p>
-            <w:pPr>
-              <w:pStyle w:val="Compact"/>
-            </w:pPr>
-            <w:r>
-              <w:rPr>
-                <w:lang w:val="de"/>
-              </w:rPr>
-              <w:t xml:space="preserve">Niemand hilft, wenn etwas klemmt</w:t>
-            </w:r>
-          </w:p>
-        </w:tc>
-        <w:tc>
-          <w:tcPr/>
-          <w:p>
-            <w:pPr>
-              <w:pStyle w:val="Compact"/>
-            </w:pPr>
-            <w:r>
-              <w:rPr>
-                <w:lang w:val="de"/>
-              </w:rPr>
-              <w:t xml:space="preserve">Eine Meldung sagt,</w:t>
-            </w:r>
-            <w:r>
-              <w:rPr>
-                <w:lang w:val="de"/>
-              </w:rPr>
-              <w:t xml:space="preserve"> </w:t>
-            </w:r>
-            <w:r>
-              <w:rPr>
-                <w:b/>
-                <w:bCs/>
-                <w:lang w:val="de"/>
-              </w:rPr>
-              <w:t xml:space="preserve">was zu tun ist</w:t>
-            </w:r>
-            <w:r>
-              <w:rPr>
-                <w:lang w:val="de"/>
-              </w:rPr>
-              <w:t xml:space="preserve"> </w:t>
-            </w:r>
-            <w:r>
-              <w:rPr>
-                <w:lang w:val="de"/>
-              </w:rPr>
-              <w:t xml:space="preserve">— nicht, was schiefging. „Feld 4 ungültig” hilft niemandem</w:t>
-            </w:r>
-          </w:p>
-        </w:tc>
-      </w:tr>
-      <w:tr>
-        <w:tc>
-          <w:tcPr/>
-          <w:p>
-            <w:pPr>
-              <w:pStyle w:val="Compact"/>
-            </w:pPr>
-            <w:r>
-              <w:rPr>
-                <w:lang w:val="de"/>
-              </w:rPr>
-              <w:t xml:space="preserve">Abends, nebenher</w:t>
-            </w:r>
-          </w:p>
-        </w:tc>
-        <w:tc>
-          <w:tcPr/>
-          <w:p>
-            <w:pPr>
-              <w:pStyle w:val="Compact"/>
-            </w:pPr>
-            <w:r>
-              <w:rPr>
-                <w:lang w:val="de"/>
-              </w:rPr>
-              <w:t xml:space="preserve">Der Weg von den erfassten Daten zur fertigen Datei muss kurz sein</w:t>
-            </w:r>
-          </w:p>
-        </w:tc>
-      </w:tr>
-    </w:tbl>
-    <w:bookmarkEnd w:id="14"/>
-    <w:bookmarkStart w:id="15" w:name="was-es-ausdrücklich-nicht-wird"/>
-    <w:p>
-      <w:pPr>
-        <w:pStyle w:val="Heading3"/>
-      </w:pPr>
-      <w:r>
-        <w:rPr>
-          <w:lang w:val="de"/>
-        </w:rPr>
-        <w:t xml:space="preserve">Was es ausdrücklich nicht wird</w:t>
-      </w:r>
-    </w:p>
-    <w:p>
-      <w:pPr>
-        <w:pStyle w:val="FirstParagraph"/>
-      </w:pPr>
-      <w:r>
-        <w:rPr>
-          <w:lang w:val="de"/>
-        </w:rPr>
-        <w:t xml:space="preserve">So wichtig wie die andere Liste — ein Projekt ohne Grenzen wird nie fertig.</w:t>
-      </w:r>
-    </w:p>
-    <w:tbl>
-      <w:tblPr>
-        <w:tblStyle w:val="Table"/>
-        <w:tblW w:type="pct" w:w="5000"/>
-        <w:tblLayout w:type="fixed"/>
-        <w:tblLook w:firstRow="1" w:lastRow="0" w:firstColumn="0" w:lastColumn="0" w:noHBand="0" w:noVBand="0" w:val="0020"/>
-      </w:tblPr>
-      <w:tblGrid>
-        <w:gridCol w:w="3960"/>
-        <w:gridCol w:w="3960"/>
-      </w:tblGrid>
-      <w:tr>
-        <w:trPr>
-          <w:tblHeader w:val="on"/>
-        </w:trPr>
-        <w:tc>
-          <w:tcPr/>
-          <w:p>
-            <w:pPr>
-              <w:pStyle w:val="Compact"/>
-            </w:pPr>
-            <w:r>
-              <w:rPr>
-                <w:lang w:val="de"/>
-              </w:rPr>
-              <w:t xml:space="preserve">Nicht</w:t>
-            </w:r>
-          </w:p>
-        </w:tc>
-        <w:tc>
-          <w:tcPr/>
-          <w:p>
-            <w:pPr>
-              <w:pStyle w:val="Compact"/>
-            </w:pPr>
-            <w:r>
-              <w:rPr>
-                <w:lang w:val="de"/>
-              </w:rPr>
-              <w:t xml:space="preserve">Warum</w:t>
-            </w:r>
-          </w:p>
-        </w:tc>
-      </w:tr>
-      <w:tr>
-        <w:tc>
-          <w:tcPr/>
-          <w:p>
-            <w:pPr>
-              <w:pStyle w:val="Compact"/>
-            </w:pPr>
-            <w:r>
-              <w:rPr>
-                <w:lang w:val="de"/>
-              </w:rPr>
-              <w:t xml:space="preserve">Kurs- und Terminverwaltung, Erinnerungen</w:t>
-            </w:r>
-          </w:p>
-        </w:tc>
-        <w:tc>
-          <w:tcPr/>
-          <w:p>
-            <w:pPr>
-              <w:pStyle w:val="Compact"/>
-            </w:pPr>
-            <w:r>
-              <w:rPr>
-                <w:lang w:val="de"/>
-              </w:rPr>
-              <w:t xml:space="preserve">ein eigenes Feld, und dafür gibt es Werkzeuge</w:t>
-            </w:r>
-          </w:p>
-        </w:tc>
-      </w:tr>
-      <w:tr>
-        <w:tc>
-          <w:tcPr/>
-          <w:p>
-            <w:pPr>
-              <w:pStyle w:val="Compact"/>
-            </w:pPr>
-            <w:r>
-              <w:rPr>
-                <w:lang w:val="de"/>
-              </w:rPr>
-              <w:t xml:space="preserve">Buchhaltung, Steuer, Einnahmenüberschussrechnung</w:t>
-            </w:r>
-          </w:p>
-        </w:tc>
-        <w:tc>
-          <w:tcPr/>
-          <w:p>
-            <w:pPr>
-              <w:pStyle w:val="Compact"/>
-            </w:pPr>
-            <w:r>
-              <w:rPr>
-                <w:lang w:val="de"/>
-              </w:rPr>
-              <w:t xml:space="preserve">ebenso, und mit eigenen Vorschriften</w:t>
-            </w:r>
-          </w:p>
-        </w:tc>
-      </w:tr>
-      <w:tr>
-        <w:tc>
-          <w:tcPr/>
-          <w:p>
-            <w:pPr>
-              <w:pStyle w:val="Compact"/>
-            </w:pPr>
-            <w:r>
-              <w:rPr>
-                <w:lang w:val="de"/>
-              </w:rPr>
-              <w:t xml:space="preserve">Privatabrechnung mit Selbstzahlern</w:t>
-            </w:r>
-          </w:p>
-        </w:tc>
-        <w:tc>
-          <w:tcPr/>
-          <w:p>
-            <w:pPr>
-              <w:pStyle w:val="Compact"/>
-            </w:pPr>
-            <w:r>
-              <w:rPr>
-                <w:lang w:val="de"/>
-              </w:rPr>
-              <w:t xml:space="preserve">ein anderes Verfahren mit anderen Regeln</w:t>
-            </w:r>
-          </w:p>
-        </w:tc>
-      </w:tr>
-      <w:tr>
-        <w:tc>
-          <w:tcPr/>
-          <w:p>
-            <w:pPr>
-              <w:pStyle w:val="Compact"/>
-            </w:pPr>
-            <w:r>
-              <w:rPr>
-                <w:lang w:val="de"/>
-              </w:rPr>
-              <w:t xml:space="preserve">Mehrbenutzerbetrieb, Praxisverwaltung</w:t>
-            </w:r>
-          </w:p>
-        </w:tc>
-        <w:tc>
-          <w:tcPr/>
-          <w:p>
-            <w:pPr>
-              <w:pStyle w:val="Compact"/>
-            </w:pPr>
-            <w:r>
-              <w:rPr>
-                <w:lang w:val="de"/>
-              </w:rPr>
-              <w:t xml:space="preserve">eine bewusste Grenze; die gewählte Datenhaltung lässt genau einen Schreiber zu</w:t>
-            </w:r>
-          </w:p>
-        </w:tc>
-      </w:tr>
-      <w:tr>
-        <w:tc>
-          <w:tcPr/>
-          <w:p>
-            <w:pPr>
-              <w:pStyle w:val="Compact"/>
-            </w:pPr>
-            <w:r>
-              <w:rPr>
-                <w:lang w:val="de"/>
-              </w:rPr>
-              <w:t xml:space="preserve">Ein mitgelieferter Katalog gültiger Positionsnummern je Bereich</w:t>
-            </w:r>
-          </w:p>
-        </w:tc>
-        <w:tc>
-          <w:tcPr/>
-          <w:p>
-            <w:pPr>
-              <w:pStyle w:val="Compact"/>
-            </w:pPr>
-            <w:r>
-              <w:rPr>
-                <w:lang w:val="de"/>
-              </w:rPr>
-              <w:t xml:space="preserve">die ergeben sich aus dem Vertrag. Das Programm hält den Rahmen bereit, die Werte trägt ein, wer den Vertrag hat</w:t>
-            </w:r>
-          </w:p>
-        </w:tc>
-      </w:tr>
-      <w:tr>
-        <w:tc>
-          <w:tcPr/>
-          <w:p>
-            <w:pPr>
-              <w:pStyle w:val="Compact"/>
-            </w:pPr>
-            <w:r>
-              <w:rPr>
-                <w:lang w:val="de"/>
-              </w:rPr>
-              <w:t xml:space="preserve">Fachliche Beratung, welche Leistung abrechenbar ist</w:t>
-            </w:r>
-          </w:p>
-        </w:tc>
-        <w:tc>
-          <w:tcPr/>
-          <w:p>
-            <w:pPr>
-              <w:pStyle w:val="Compact"/>
-            </w:pPr>
-            <w:r>
-              <w:rPr>
-                <w:lang w:val="de"/>
-              </w:rPr>
-              <w:t xml:space="preserve">das entscheidet ebenfalls der Vertrag, nicht ein Programm</w:t>
-            </w:r>
-          </w:p>
-        </w:tc>
-      </w:tr>
-    </w:tbl>
-    <w:bookmarkEnd w:id="15"/>
-    <w:bookmarkEnd w:id="16"/>
-    <w:bookmarkStart w:id="18" w:name="entscheidung"/>
-    <w:p>
-      <w:pPr>
-        <w:pStyle w:val="Heading2"/>
-      </w:pPr>
-      <w:r>
-        <w:rPr>
-          <w:lang w:val="de"/>
-        </w:rPr>
-        <w:t xml:space="preserve">Entscheidung</w:t>
-      </w:r>
-    </w:p>
-    <w:p>
-      <w:pPr>
-        <w:pStyle w:val="FirstParagraph"/>
-      </w:pPr>
-      <w:r>
-        <w:rPr>
-          <w:b/>
-          <w:bCs/>
-          <w:lang w:val="de"/>
-        </w:rPr>
-        <w:t xml:space="preserve">Das Projekt wird ein Einzelplatzprogramm, das aus vorhandenen Leistungsdaten</w:t>
-      </w:r>
-      <w:r>
-        <w:rPr>
-          <w:b/>
-          <w:bCs/>
-          <w:lang w:val="de"/>
-        </w:rPr>
-        <w:t xml:space="preserve"> </w:t>
-      </w:r>
-      <w:r>
-        <w:rPr>
-          <w:b/>
-          <w:bCs/>
-          <w:lang w:val="de"/>
-        </w:rPr>
-        <w:t xml:space="preserve">eine prüffähige Abrechnungsdatei erzeugt — und das jede Datei prüft, bevor sie</w:t>
-      </w:r>
-      <w:r>
-        <w:rPr>
-          <w:b/>
-          <w:bCs/>
-          <w:lang w:val="de"/>
-        </w:rPr>
-        <w:t xml:space="preserve"> </w:t>
-      </w:r>
-      <w:r>
-        <w:rPr>
-          <w:b/>
-          <w:bCs/>
-          <w:lang w:val="de"/>
-        </w:rPr>
-        <w:t xml:space="preserve">hinausgeht.</w:t>
-      </w:r>
-      <w:r>
-        <w:rPr>
-          <w:lang w:val="de"/>
-        </w:rPr>
-        <w:t xml:space="preserve"> </w:t>
-      </w:r>
-      <w:r>
-        <w:rPr>
-          <w:lang w:val="de"/>
-        </w:rPr>
-        <w:t xml:space="preserve">Der Aufbau folgt dem Verfahren, nicht einem einzelnen</w:t>
-      </w:r>
-      <w:r>
-        <w:rPr>
-          <w:lang w:val="de"/>
-        </w:rPr>
-        <w:t xml:space="preserve"> </w:t>
-      </w:r>
-      <w:r>
-        <w:rPr>
-          <w:lang w:val="de"/>
-        </w:rPr>
-        <w:t xml:space="preserve">Leistungsbereich; der erste bediente ist die Hebammenhilfe.</w:t>
-      </w:r>
-    </w:p>
-    <w:p>
-      <w:pPr>
-        <w:pStyle w:val="BodyText"/>
-      </w:pPr>
-      <w:r>
-        <w:rPr>
-          <w:lang w:val="de"/>
-        </w:rPr>
-        <w:t xml:space="preserve">Von den sieben Punkten der Vision werden damit</w:t>
-      </w:r>
-      <w:r>
-        <w:rPr>
-          <w:lang w:val="de"/>
-        </w:rPr>
-        <w:t xml:space="preserve"> </w:t>
-      </w:r>
-      <w:r>
-        <w:rPr>
-          <w:b/>
-          <w:bCs/>
-          <w:lang w:val="de"/>
-        </w:rPr>
-        <w:t xml:space="preserve">die ersten fünf zum Bauauftrag</w:t>
-      </w:r>
-      <w:r>
-        <w:rPr>
-          <w:lang w:val="de"/>
-        </w:rPr>
-        <w:t xml:space="preserve"> </w:t>
-      </w:r>
-      <w:r>
-        <w:rPr>
-          <w:lang w:val="de"/>
-        </w:rPr>
-        <w:t xml:space="preserve">— gegliedert in fünf Kernfähigkeiten. Die Punkte 6 und 7, Nachbearbeitung einer</w:t>
-      </w:r>
-      <w:r>
-        <w:rPr>
-          <w:lang w:val="de"/>
-        </w:rPr>
-        <w:t xml:space="preserve"> </w:t>
-      </w:r>
-      <w:r>
-        <w:rPr>
-          <w:lang w:val="de"/>
-        </w:rPr>
-        <w:t xml:space="preserve">Zurückweisung und ein weiterer Leistungsbereich, bleiben Ziel, aber nicht</w:t>
-      </w:r>
-      <w:r>
-        <w:rPr>
-          <w:lang w:val="de"/>
-        </w:rPr>
-        <w:t xml:space="preserve"> </w:t>
-      </w:r>
-      <w:r>
-        <w:rPr>
-          <w:lang w:val="de"/>
-        </w:rPr>
-        <w:t xml:space="preserve">Gegenstand des ersten Durchgangs.</w:t>
+        <w:t xml:space="preserve">unterschiedlich geformte Kosten</w:t>
+      </w:r>
+      <w:r>
+        <w:rPr>
+          <w:lang w:val="de"/>
+        </w:rPr>
+        <w:t xml:space="preserve"> </w:t>
+      </w:r>
+      <w:r>
+        <w:rPr>
+          <w:lang w:val="de"/>
+        </w:rPr>
+        <w:t xml:space="preserve">— das ist der Kern der</w:t>
+      </w:r>
+      <w:r>
+        <w:rPr>
+          <w:lang w:val="de"/>
+        </w:rPr>
+        <w:t xml:space="preserve"> </w:t>
+      </w:r>
+      <w:r>
+        <w:rPr>
+          <w:lang w:val="de"/>
+        </w:rPr>
+        <w:t xml:space="preserve">Sache:</w:t>
       </w:r>
     </w:p>
     <w:tbl>
@@ -2344,39 +1160,33 @@
             <w:pPr>
               <w:pStyle w:val="Compact"/>
             </w:pPr>
-            <w:r>
-              <w:rPr>
-                <w:lang w:val="de"/>
-              </w:rPr>
-              <w:t xml:space="preserve">#</w:t>
-            </w:r>
-          </w:p>
-        </w:tc>
-        <w:tc>
-          <w:tcPr/>
-          <w:p>
-            <w:pPr>
-              <w:pStyle w:val="Compact"/>
-            </w:pPr>
-            <w:r>
-              <w:rPr>
-                <w:lang w:val="de"/>
-              </w:rPr>
-              <w:t xml:space="preserve">Kernfähigkeit</w:t>
-            </w:r>
-          </w:p>
-        </w:tc>
-        <w:tc>
-          <w:tcPr/>
-          <w:p>
-            <w:pPr>
-              <w:pStyle w:val="Compact"/>
-            </w:pPr>
-            <w:r>
-              <w:rPr>
-                <w:lang w:val="de"/>
-              </w:rPr>
-              <w:t xml:space="preserve">Was dahintersteckt</w:t>
+          </w:p>
+        </w:tc>
+        <w:tc>
+          <w:tcPr/>
+          <w:p>
+            <w:pPr>
+              <w:pStyle w:val="Compact"/>
+            </w:pPr>
+            <w:r>
+              <w:rPr>
+                <w:lang w:val="de"/>
+              </w:rPr>
+              <w:t xml:space="preserve">Abrechnungsstelle</w:t>
+            </w:r>
+          </w:p>
+        </w:tc>
+        <w:tc>
+          <w:tcPr/>
+          <w:p>
+            <w:pPr>
+              <w:pStyle w:val="Compact"/>
+            </w:pPr>
+            <w:r>
+              <w:rPr>
+                <w:lang w:val="de"/>
+              </w:rPr>
+              <w:t xml:space="preserve">Selbst abrechnen</w:t>
             </w:r>
           </w:p>
         </w:tc>
@@ -2390,39 +1200,39 @@
             </w:pPr>
             <w:r>
               <w:rPr>
-                <w:lang w:val="de"/>
-              </w:rPr>
-              <w:t xml:space="preserve">1</w:t>
-            </w:r>
-          </w:p>
-        </w:tc>
-        <w:tc>
-          <w:tcPr/>
-          <w:p>
-            <w:pPr>
-              <w:pStyle w:val="Compact"/>
-            </w:pPr>
-            <w:r>
-              <w:rPr>
                 <w:b/>
                 <w:bCs/>
                 <w:lang w:val="de"/>
               </w:rPr>
-              <w:t xml:space="preserve">Stammdaten führen</w:t>
-            </w:r>
-          </w:p>
-        </w:tc>
-        <w:tc>
-          <w:tcPr/>
-          <w:p>
-            <w:pPr>
-              <w:pStyle w:val="Compact"/>
-            </w:pPr>
-            <w:r>
-              <w:rPr>
-                <w:lang w:val="de"/>
-              </w:rPr>
-              <w:t xml:space="preserve">versicherte Personen mit ihren Versicherungsangaben, die Leistungserbringerin selbst, Leistungsfälle als Zusammenfassung — ein Kurs, eine Behandlungsserie</w:t>
+              <w:t xml:space="preserve">Art der Kosten</w:t>
+            </w:r>
+          </w:p>
+        </w:tc>
+        <w:tc>
+          <w:tcPr/>
+          <w:p>
+            <w:pPr>
+              <w:pStyle w:val="Compact"/>
+            </w:pPr>
+            <w:r>
+              <w:rPr>
+                <w:lang w:val="de"/>
+              </w:rPr>
+              <w:t xml:space="preserve">ein Anteil am abgerechneten Betrag</w:t>
+            </w:r>
+          </w:p>
+        </w:tc>
+        <w:tc>
+          <w:tcPr/>
+          <w:p>
+            <w:pPr>
+              <w:pStyle w:val="Compact"/>
+            </w:pPr>
+            <w:r>
+              <w:rPr>
+                <w:lang w:val="de"/>
+              </w:rPr>
+              <w:t xml:space="preserve">ein fester Betrag im Jahr</w:t>
             </w:r>
           </w:p>
         </w:tc>
@@ -2436,39 +1246,39 @@
             </w:pPr>
             <w:r>
               <w:rPr>
-                <w:lang w:val="de"/>
-              </w:rPr>
-              <w:t xml:space="preserve">2</w:t>
-            </w:r>
-          </w:p>
-        </w:tc>
-        <w:tc>
-          <w:tcPr/>
-          <w:p>
-            <w:pPr>
-              <w:pStyle w:val="Compact"/>
-            </w:pPr>
-            <w:r>
-              <w:rPr>
                 <w:b/>
                 <w:bCs/>
                 <w:lang w:val="de"/>
               </w:rPr>
-              <w:t xml:space="preserve">Leistungen beschreiben</w:t>
-            </w:r>
-          </w:p>
-        </w:tc>
-        <w:tc>
-          <w:tcPr/>
-          <w:p>
-            <w:pPr>
-              <w:pStyle w:val="Compact"/>
-            </w:pPr>
-            <w:r>
-              <w:rPr>
-                <w:lang w:val="de"/>
-              </w:rPr>
-              <w:t xml:space="preserve">was eine Einheit kostet, unter welcher Position sie abgerechnet wird — einmal festgelegt, mehrfach verwendet. Hier sitzt das Bereichsspezifische</w:t>
+              <w:t xml:space="preserve">Wächst mit</w:t>
+            </w:r>
+          </w:p>
+        </w:tc>
+        <w:tc>
+          <w:tcPr/>
+          <w:p>
+            <w:pPr>
+              <w:pStyle w:val="Compact"/>
+            </w:pPr>
+            <w:r>
+              <w:rPr>
+                <w:lang w:val="de"/>
+              </w:rPr>
+              <w:t xml:space="preserve">dem Umsatz</w:t>
+            </w:r>
+          </w:p>
+        </w:tc>
+        <w:tc>
+          <w:tcPr/>
+          <w:p>
+            <w:pPr>
+              <w:pStyle w:val="Compact"/>
+            </w:pPr>
+            <w:r>
+              <w:rPr>
+                <w:lang w:val="de"/>
+              </w:rPr>
+              <w:t xml:space="preserve">nichts — der Betrag bleibt</w:t>
             </w:r>
           </w:p>
         </w:tc>
@@ -2482,39 +1292,39 @@
             </w:pPr>
             <w:r>
               <w:rPr>
-                <w:lang w:val="de"/>
-              </w:rPr>
-              <w:t xml:space="preserve">3</w:t>
-            </w:r>
-          </w:p>
-        </w:tc>
-        <w:tc>
-          <w:tcPr/>
-          <w:p>
-            <w:pPr>
-              <w:pStyle w:val="Compact"/>
-            </w:pPr>
-            <w:r>
-              <w:rPr>
                 <w:b/>
                 <w:bCs/>
                 <w:lang w:val="de"/>
               </w:rPr>
-              <w:t xml:space="preserve">Abrechnung erzeugen</w:t>
-            </w:r>
-          </w:p>
-        </w:tc>
-        <w:tc>
-          <w:tcPr/>
-          <w:p>
-            <w:pPr>
-              <w:pStyle w:val="Compact"/>
-            </w:pPr>
-            <w:r>
-              <w:rPr>
-                <w:lang w:val="de"/>
-              </w:rPr>
-              <w:t xml:space="preserve">aus Leistungsfall, Beschreibung und Anzahl der Einheiten entsteht die Nachricht im vorgeschriebenen Format</w:t>
+              <w:t xml:space="preserve">Läuft weiter</w:t>
+            </w:r>
+          </w:p>
+        </w:tc>
+        <w:tc>
+          <w:tcPr/>
+          <w:p>
+            <w:pPr>
+              <w:pStyle w:val="Compact"/>
+            </w:pPr>
+            <w:r>
+              <w:rPr>
+                <w:lang w:val="de"/>
+              </w:rPr>
+              <w:t xml:space="preserve">solange abgerechnet wird</w:t>
+            </w:r>
+          </w:p>
+        </w:tc>
+        <w:tc>
+          <w:tcPr/>
+          <w:p>
+            <w:pPr>
+              <w:pStyle w:val="Compact"/>
+            </w:pPr>
+            <w:r>
+              <w:rPr>
+                <w:lang w:val="de"/>
+              </w:rPr>
+              <w:t xml:space="preserve">solange abgerechnet wird</w:t>
             </w:r>
           </w:p>
         </w:tc>
@@ -2528,135 +1338,114 @@
             </w:pPr>
             <w:r>
               <w:rPr>
-                <w:lang w:val="de"/>
-              </w:rPr>
-              <w:t xml:space="preserve">4</w:t>
-            </w:r>
-          </w:p>
-        </w:tc>
-        <w:tc>
-          <w:tcPr/>
-          <w:p>
-            <w:pPr>
-              <w:pStyle w:val="Compact"/>
-            </w:pPr>
-            <w:r>
-              <w:rPr>
                 <w:b/>
                 <w:bCs/>
                 <w:lang w:val="de"/>
               </w:rPr>
-              <w:t xml:space="preserve">Prüfen</w:t>
-            </w:r>
-          </w:p>
-        </w:tc>
-        <w:tc>
-          <w:tcPr/>
-          <w:p>
-            <w:pPr>
-              <w:pStyle w:val="Compact"/>
-            </w:pPr>
-            <w:r>
-              <w:rPr>
-                <w:lang w:val="de"/>
-              </w:rPr>
-              <w:t xml:space="preserve">Aufbau, Zähler, Summen, Pflichtangaben — ein Fehler hält den gesamten Lauf auf</w:t>
-            </w:r>
-          </w:p>
-        </w:tc>
-      </w:tr>
-      <w:tr>
-        <w:tc>
-          <w:tcPr/>
-          <w:p>
-            <w:pPr>
-              <w:pStyle w:val="Compact"/>
-            </w:pPr>
-            <w:r>
-              <w:rPr>
-                <w:lang w:val="de"/>
-              </w:rPr>
-              <w:t xml:space="preserve">5</w:t>
-            </w:r>
-          </w:p>
-        </w:tc>
-        <w:tc>
-          <w:tcPr/>
-          <w:p>
-            <w:pPr>
-              <w:pStyle w:val="Compact"/>
-            </w:pPr>
-            <w:r>
-              <w:rPr>
-                <w:b/>
-                <w:bCs/>
-                <w:lang w:val="de"/>
-              </w:rPr>
-              <w:t xml:space="preserve">Zustellen und einordnen</w:t>
-            </w:r>
-          </w:p>
-        </w:tc>
-        <w:tc>
-          <w:tcPr/>
-          <w:p>
-            <w:pPr>
-              <w:pStyle w:val="Compact"/>
-            </w:pPr>
-            <w:r>
-              <w:rPr>
-                <w:lang w:val="de"/>
-              </w:rPr>
-              <w:t xml:space="preserve">die Datei an den richtigen Empfänger, und die Antwort verständlich machen</w:t>
+              <w:t xml:space="preserve">Zusätzlich</w:t>
+            </w:r>
+          </w:p>
+        </w:tc>
+        <w:tc>
+          <w:tcPr/>
+          <w:p>
+            <w:pPr>
+              <w:pStyle w:val="Compact"/>
+            </w:pPr>
+            <w:r>
+              <w:rPr>
+                <w:lang w:val="de"/>
+              </w:rPr>
+              <w:t xml:space="preserve">—</w:t>
+            </w:r>
+          </w:p>
+        </w:tc>
+        <w:tc>
+          <w:tcPr/>
+          <w:p>
+            <w:pPr>
+              <w:pStyle w:val="Compact"/>
+            </w:pPr>
+            <w:r>
+              <w:rPr>
+                <w:lang w:val="de"/>
+              </w:rPr>
+              <w:t xml:space="preserve">die eigene Zeit für Pflege und Änderungen</w:t>
             </w:r>
           </w:p>
         </w:tc>
       </w:tr>
     </w:tbl>
-    <w:bookmarkStart w:id="17" w:name="warum-nicht-der-einfachere-weg"/>
-    <w:p>
-      <w:pPr>
-        <w:pStyle w:val="Heading3"/>
-      </w:pPr>
-      <w:r>
-        <w:rPr>
-          <w:lang w:val="de"/>
-        </w:rPr>
-        <w:t xml:space="preserve">Warum nicht der einfachere Weg</w:t>
-      </w:r>
-    </w:p>
-    <w:p>
-      <w:pPr>
-        <w:pStyle w:val="FirstParagraph"/>
-      </w:pPr>
-      <w:r>
-        <w:rPr>
-          <w:lang w:val="de"/>
-        </w:rPr>
-        <w:t xml:space="preserve">Man könnte auf Nummer 4 verzichten und darauf setzen, dass die Empfängerseite</w:t>
-      </w:r>
-      <w:r>
-        <w:rPr>
-          <w:lang w:val="de"/>
-        </w:rPr>
-        <w:t xml:space="preserve"> </w:t>
-      </w:r>
-      <w:r>
-        <w:rPr>
-          <w:lang w:val="de"/>
-        </w:rPr>
-        <w:t xml:space="preserve">schon meckern wird — das wäre erheblich weniger Arbeit. Dagegen steht der Preis</w:t>
-      </w:r>
-      <w:r>
-        <w:rPr>
-          <w:lang w:val="de"/>
-        </w:rPr>
-        <w:t xml:space="preserve"> </w:t>
-      </w:r>
-      <w:r>
-        <w:rPr>
-          <w:lang w:val="de"/>
-        </w:rPr>
-        <w:t xml:space="preserve">einer Beanstandung:</w:t>
+    <w:p>
+      <w:pPr>
+        <w:pStyle w:val="BodyText"/>
+      </w:pPr>
+      <w:r>
+        <w:rPr>
+          <w:lang w:val="de"/>
+        </w:rPr>
+        <w:t xml:space="preserve">Daraus folgt eine einfache Regel:</w:t>
+      </w:r>
+      <w:r>
+        <w:rPr>
+          <w:lang w:val="de"/>
+        </w:rPr>
+        <w:t xml:space="preserve"> </w:t>
+      </w:r>
+      <w:r>
+        <w:rPr>
+          <w:b/>
+          <w:bCs/>
+          <w:lang w:val="de"/>
+        </w:rPr>
+        <w:t xml:space="preserve">Prozentkosten wachsen mit, Festkosten nicht.</w:t>
+      </w:r>
+      <w:r>
+        <w:rPr>
+          <w:lang w:val="de"/>
+        </w:rPr>
+        <w:t xml:space="preserve"> </w:t>
+      </w:r>
+      <w:r>
+        <w:rPr>
+          <w:lang w:val="de"/>
+        </w:rPr>
+        <w:t xml:space="preserve">Unterhalb eines bestimmten Jahresumsatzes gewinnt der Dienstleister, oberhalb der</w:t>
+      </w:r>
+      <w:r>
+        <w:rPr>
+          <w:lang w:val="de"/>
+        </w:rPr>
+        <w:t xml:space="preserve"> </w:t>
+      </w:r>
+      <w:r>
+        <w:rPr>
+          <w:lang w:val="de"/>
+        </w:rPr>
+        <w:t xml:space="preserve">eigene Weg. Wo dieser Punkt liegt, hängt an Zahlen, die hier noch nicht alle</w:t>
+      </w:r>
+      <w:r>
+        <w:rPr>
+          <w:lang w:val="de"/>
+        </w:rPr>
+        <w:t xml:space="preserve"> </w:t>
+      </w:r>
+      <w:r>
+        <w:rPr>
+          <w:lang w:val="de"/>
+        </w:rPr>
+        <w:t xml:space="preserve">vorliegen.</w:t>
+      </w:r>
+    </w:p>
+    <w:p>
+      <w:pPr>
+        <w:pStyle w:val="BodyText"/>
+      </w:pPr>
+      <w:r>
+        <w:rPr>
+          <w:lang w:val="de"/>
+        </w:rPr>
+        <w:t xml:space="preserve">Zwei davon sind bereits bekannt und gehören in die Rechnung:</w:t>
       </w:r>
     </w:p>
     <w:tbl>
@@ -2684,7 +1473,7 @@
               <w:rPr>
                 <w:lang w:val="de"/>
               </w:rPr>
-              <w:t xml:space="preserve">Wo der Fehler auffällt</w:t>
+              <w:t xml:space="preserve">Posten</w:t>
             </w:r>
           </w:p>
         </w:tc>
@@ -2714,21 +1503,35 @@
               <w:rPr>
                 <w:lang w:val="de"/>
               </w:rPr>
-              <w:t xml:space="preserve">im eigenen Programm, vor dem Versand</w:t>
-            </w:r>
-          </w:p>
-        </w:tc>
-        <w:tc>
-          <w:tcPr/>
-          <w:p>
-            <w:pPr>
-              <w:pStyle w:val="Compact"/>
-            </w:pPr>
-            <w:r>
-              <w:rPr>
-                <w:lang w:val="de"/>
-              </w:rPr>
-              <w:t xml:space="preserve">dreißig Sekunden</w:t>
+              <w:t xml:space="preserve">Das Zertifikat für die Übermittlung</w:t>
+            </w:r>
+          </w:p>
+        </w:tc>
+        <w:tc>
+          <w:tcPr/>
+          <w:p>
+            <w:pPr>
+              <w:pStyle w:val="Compact"/>
+            </w:pPr>
+            <w:r>
+              <w:rPr>
+                <w:lang w:val="de"/>
+              </w:rPr>
+              <w:t xml:space="preserve">im ersten Jahr mehr als in den folgenden,</w:t>
+            </w:r>
+            <w:r>
+              <w:rPr>
+                <w:lang w:val="de"/>
+              </w:rPr>
+              <w:t xml:space="preserve"> </w:t>
+            </w:r>
+            <w:r>
+              <w:rPr>
+                <w:b/>
+                <w:bCs/>
+                <w:lang w:val="de"/>
+              </w:rPr>
+              <w:t xml:space="preserve">je Betriebsstätte und Jahr, nicht je Kasse</w:t>
             </w:r>
           </w:p>
         </w:tc>
@@ -2744,21 +1547,51 @@
               <w:rPr>
                 <w:lang w:val="de"/>
               </w:rPr>
-              <w:t xml:space="preserve">bei der Kasse, Wochen später</w:t>
-            </w:r>
-          </w:p>
-        </w:tc>
-        <w:tc>
-          <w:tcPr/>
-          <w:p>
-            <w:pPr>
-              <w:pStyle w:val="Compact"/>
-            </w:pPr>
-            <w:r>
-              <w:rPr>
-                <w:lang w:val="de"/>
-              </w:rPr>
-              <w:t xml:space="preserve">ein vollständiger Wiederholungsdurchlauf</w:t>
+              <w:t xml:space="preserve">Die Betriebsnummer für den Abrechnungsverkehr</w:t>
+            </w:r>
+          </w:p>
+        </w:tc>
+        <w:tc>
+          <w:tcPr/>
+          <w:p>
+            <w:pPr>
+              <w:pStyle w:val="Compact"/>
+            </w:pPr>
+            <w:r>
+              <w:rPr>
+                <w:lang w:val="de"/>
+              </w:rPr>
+              <w:t xml:space="preserve">gebührenfrei</w:t>
+            </w:r>
+          </w:p>
+        </w:tc>
+      </w:tr>
+      <w:tr>
+        <w:tc>
+          <w:tcPr/>
+          <w:p>
+            <w:pPr>
+              <w:pStyle w:val="Compact"/>
+            </w:pPr>
+            <w:r>
+              <w:rPr>
+                <w:lang w:val="de"/>
+              </w:rPr>
+              <w:t xml:space="preserve">Die laufende Pflege</w:t>
+            </w:r>
+          </w:p>
+        </w:tc>
+        <w:tc>
+          <w:tcPr/>
+          <w:p>
+            <w:pPr>
+              <w:pStyle w:val="Compact"/>
+            </w:pPr>
+            <w:r>
+              <w:rPr>
+                <w:lang w:val="de"/>
+              </w:rPr>
+              <w:t xml:space="preserve">keine Rechnung, aber Zeit — die Vorgaben ändern sich jährlich</w:t>
             </w:r>
           </w:p>
         </w:tc>
@@ -2772,24 +1605,155 @@
         <w:rPr>
           <w:lang w:val="de"/>
         </w:rPr>
-        <w:t xml:space="preserve">Ohne die Prüfung wäre das Programm ein Dateischreiber, und dafür lohnt der</w:t>
-      </w:r>
-      <w:r>
-        <w:rPr>
-          <w:lang w:val="de"/>
-        </w:rPr>
-        <w:t xml:space="preserve"> </w:t>
-      </w:r>
-      <w:r>
-        <w:rPr>
-          <w:lang w:val="de"/>
-        </w:rPr>
-        <w:t xml:space="preserve">Aufwand nicht.</w:t>
-      </w:r>
-    </w:p>
-    <w:bookmarkEnd w:id="17"/>
-    <w:bookmarkEnd w:id="18"/>
-    <w:bookmarkStart w:id="29" w:name="ergebnis"/>
+        <w:t xml:space="preserve">Der letzte Posten ist der, den man beim Rechnen vergisst.</w:t>
+      </w:r>
+      <w:r>
+        <w:rPr>
+          <w:lang w:val="de"/>
+        </w:rPr>
+        <w:t xml:space="preserve"> </w:t>
+      </w:r>
+      <w:r>
+        <w:rPr>
+          <w:b/>
+          <w:bCs/>
+          <w:lang w:val="de"/>
+        </w:rPr>
+        <w:t xml:space="preserve">Ein Programm, das</w:t>
+      </w:r>
+      <w:r>
+        <w:rPr>
+          <w:b/>
+          <w:bCs/>
+          <w:lang w:val="de"/>
+        </w:rPr>
+        <w:t xml:space="preserve"> </w:t>
+      </w:r>
+      <w:r>
+        <w:rPr>
+          <w:b/>
+          <w:bCs/>
+          <w:lang w:val="de"/>
+        </w:rPr>
+        <w:t xml:space="preserve">niemand pflegt, wird nicht billiger — es hört auf zu funktionieren</w:t>
+      </w:r>
+      <w:r>
+        <w:rPr>
+          <w:lang w:val="de"/>
+        </w:rPr>
+        <w:t xml:space="preserve">, weil ein</w:t>
+      </w:r>
+      <w:r>
+        <w:rPr>
+          <w:lang w:val="de"/>
+        </w:rPr>
+        <w:t xml:space="preserve"> </w:t>
+      </w:r>
+      <w:r>
+        <w:rPr>
+          <w:lang w:val="de"/>
+        </w:rPr>
+        <w:t xml:space="preserve">Schlüsselverzeichnis wechselt oder eine Formatfassung abgelöst wird. Deshalb</w:t>
+      </w:r>
+      <w:r>
+        <w:rPr>
+          <w:lang w:val="de"/>
+        </w:rPr>
+        <w:t xml:space="preserve"> </w:t>
+      </w:r>
+      <w:r>
+        <w:rPr>
+          <w:lang w:val="de"/>
+        </w:rPr>
+        <w:t xml:space="preserve">zählt Pflege in dieser Rechnung als Kosten, auch wenn keine Rechnung dafür kommt.</w:t>
+      </w:r>
+    </w:p>
+    <w:p>
+      <w:pPr>
+        <w:pStyle w:val="BodyText"/>
+      </w:pPr>
+      <w:r>
+        <w:rPr>
+          <w:lang w:val="de"/>
+        </w:rPr>
+        <w:t xml:space="preserve">Diese Gegenüberstellung wird in Teil 23 mit den dann bekannten Zahlen</w:t>
+      </w:r>
+      <w:r>
+        <w:rPr>
+          <w:lang w:val="de"/>
+        </w:rPr>
+        <w:t xml:space="preserve"> </w:t>
+      </w:r>
+      <w:r>
+        <w:rPr>
+          <w:lang w:val="de"/>
+        </w:rPr>
+        <w:t xml:space="preserve">nachgerechnet — und zwar ergebnisoffen. Es ist ein zulässiges Ergebnis dieses</w:t>
+      </w:r>
+      <w:r>
+        <w:rPr>
+          <w:lang w:val="de"/>
+        </w:rPr>
+        <w:t xml:space="preserve"> </w:t>
+      </w:r>
+      <w:r>
+        <w:rPr>
+          <w:lang w:val="de"/>
+        </w:rPr>
+        <w:t xml:space="preserve">Projekts, dass sich der eigene Weg nicht lohnt.</w:t>
+      </w:r>
+    </w:p>
+    <w:bookmarkEnd w:id="10"/>
+    <w:bookmarkStart w:id="11" w:name="was-hier-noch-offen-ist"/>
+    <w:p>
+      <w:pPr>
+        <w:pStyle w:val="Heading3"/>
+      </w:pPr>
+      <w:r>
+        <w:rPr>
+          <w:lang w:val="de"/>
+        </w:rPr>
+        <w:t xml:space="preserve">Was hier noch offen ist</w:t>
+      </w:r>
+    </w:p>
+    <w:p>
+      <w:pPr>
+        <w:pStyle w:val="FirstParagraph"/>
+      </w:pPr>
+      <w:r>
+        <w:rPr>
+          <w:lang w:val="de"/>
+        </w:rPr>
+        <w:t xml:space="preserve">Nicht jeder Punkt ist am Ende dieses Teils entschieden, und nicht jeder ist</w:t>
+      </w:r>
+      <w:r>
+        <w:rPr>
+          <w:lang w:val="de"/>
+        </w:rPr>
+        <w:t xml:space="preserve"> </w:t>
+      </w:r>
+      <w:r>
+        <w:rPr>
+          <w:lang w:val="de"/>
+        </w:rPr>
+        <w:t xml:space="preserve">allein durch Programmieren erreichbar — Punkt 4 hängt an Zulassungen, die niemand</w:t>
+      </w:r>
+      <w:r>
+        <w:rPr>
+          <w:lang w:val="de"/>
+        </w:rPr>
+        <w:t xml:space="preserve"> </w:t>
+      </w:r>
+      <w:r>
+        <w:rPr>
+          <w:lang w:val="de"/>
+        </w:rPr>
+        <w:t xml:space="preserve">schreiben kann. Das ist Gegenstand von Teil 04.</w:t>
+      </w:r>
+    </w:p>
+    <w:bookmarkEnd w:id="11"/>
+    <w:bookmarkEnd w:id="12"/>
+    <w:bookmarkStart w:id="13" w:name="ziel-dieses-teils"/>
     <w:p>
       <w:pPr>
         <w:pStyle w:val="Heading2"/>
@@ -2798,10 +1762,92 @@
         <w:rPr>
           <w:lang w:val="de"/>
         </w:rPr>
-        <w:t xml:space="preserve">Ergebnis</w:t>
-      </w:r>
-    </w:p>
-    <w:bookmarkStart w:id="19" w:name="das-zielbild"/>
+        <w:t xml:space="preserve">Ziel dieses Teils</w:t>
+      </w:r>
+    </w:p>
+    <w:p>
+      <w:pPr>
+        <w:pStyle w:val="Compact"/>
+        <w:numPr>
+          <w:ilvl w:val="0"/>
+          <w:numId w:val="1001"/>
+        </w:numPr>
+      </w:pPr>
+      <w:r>
+        <w:rPr>
+          <w:lang w:val="de"/>
+        </w:rPr>
+        <w:t xml:space="preserve">Festlegen, was das Programm können soll — und ebenso wichtig, was nicht.</w:t>
+      </w:r>
+    </w:p>
+    <w:p>
+      <w:pPr>
+        <w:pStyle w:val="Compact"/>
+        <w:numPr>
+          <w:ilvl w:val="0"/>
+          <w:numId w:val="1001"/>
+        </w:numPr>
+      </w:pPr>
+      <w:r>
+        <w:rPr>
+          <w:lang w:val="de"/>
+        </w:rPr>
+        <w:t xml:space="preserve">Entscheiden, wie weit es tragen soll: ein Programm für einen Kursanbieter oder</w:t>
+      </w:r>
+      <w:r>
+        <w:rPr>
+          <w:lang w:val="de"/>
+        </w:rPr>
+        <w:t xml:space="preserve"> </w:t>
+      </w:r>
+      <w:r>
+        <w:rPr>
+          <w:lang w:val="de"/>
+        </w:rPr>
+        <w:t xml:space="preserve">eines für die Abrechnung mit gesetzlichen Kassen überhaupt.</w:t>
+      </w:r>
+    </w:p>
+    <w:p>
+      <w:pPr>
+        <w:pStyle w:val="Compact"/>
+        <w:numPr>
+          <w:ilvl w:val="0"/>
+          <w:numId w:val="1001"/>
+        </w:numPr>
+      </w:pPr>
+      <w:r>
+        <w:rPr>
+          <w:lang w:val="de"/>
+        </w:rPr>
+        <w:t xml:space="preserve">Ein erstes Bild der Fachlichkeit: welche Begriffe es gibt, wie sie</w:t>
+      </w:r>
+      <w:r>
+        <w:rPr>
+          <w:lang w:val="de"/>
+        </w:rPr>
+        <w:t xml:space="preserve"> </w:t>
+      </w:r>
+      <w:r>
+        <w:rPr>
+          <w:lang w:val="de"/>
+        </w:rPr>
+        <w:t xml:space="preserve">zusammenhängen, was von ihnen dauerhaft festgehalten werden muss.</w:t>
+      </w:r>
+    </w:p>
+    <w:bookmarkEnd w:id="13"/>
+    <w:bookmarkStart w:id="18" w:name="überlegungen"/>
+    <w:p>
+      <w:pPr>
+        <w:pStyle w:val="Heading2"/>
+      </w:pPr>
+      <w:r>
+        <w:rPr>
+          <w:lang w:val="de"/>
+        </w:rPr>
+        <w:t xml:space="preserve">Überlegungen</w:t>
+      </w:r>
+    </w:p>
+    <w:bookmarkStart w:id="14" w:name="was-der-eigentliche-wert-wäre"/>
     <w:p>
       <w:pPr>
         <w:pStyle w:val="Heading3"/>
@@ -2810,7 +1856,270 @@
         <w:rPr>
           <w:lang w:val="de"/>
         </w:rPr>
-        <w:t xml:space="preserve">Das Zielbild</w:t>
+        <w:t xml:space="preserve">Was der eigentliche Wert wäre</w:t>
+      </w:r>
+    </w:p>
+    <w:p>
+      <w:pPr>
+        <w:pStyle w:val="FirstParagraph"/>
+      </w:pPr>
+      <w:r>
+        <w:rPr>
+          <w:lang w:val="de"/>
+        </w:rPr>
+        <w:t xml:space="preserve">Der naheliegende Gedanke — ein Programm, das eine Datei erzeugt — ist richtig</w:t>
+      </w:r>
+      <w:r>
+        <w:rPr>
+          <w:lang w:val="de"/>
+        </w:rPr>
+        <w:t xml:space="preserve"> </w:t>
+      </w:r>
+      <w:r>
+        <w:rPr>
+          <w:lang w:val="de"/>
+        </w:rPr>
+        <w:t xml:space="preserve">und zu kurz gedacht. Eine Datei zu erzeugen ist der leichte Teil. Der schwere</w:t>
+      </w:r>
+      <w:r>
+        <w:rPr>
+          <w:lang w:val="de"/>
+        </w:rPr>
+        <w:t xml:space="preserve"> </w:t>
+      </w:r>
+      <w:r>
+        <w:rPr>
+          <w:lang w:val="de"/>
+        </w:rPr>
+        <w:t xml:space="preserve">ist, dass sie</w:t>
+      </w:r>
+      <w:r>
+        <w:rPr>
+          <w:lang w:val="de"/>
+        </w:rPr>
+        <w:t xml:space="preserve"> </w:t>
+      </w:r>
+      <w:r>
+        <w:rPr>
+          <w:b/>
+          <w:bCs/>
+          <w:lang w:val="de"/>
+        </w:rPr>
+        <w:t xml:space="preserve">stimmt</w:t>
+      </w:r>
+      <w:r>
+        <w:rPr>
+          <w:lang w:val="de"/>
+        </w:rPr>
+        <w:t xml:space="preserve">.</w:t>
+      </w:r>
+    </w:p>
+    <w:p>
+      <w:pPr>
+        <w:pStyle w:val="BodyText"/>
+      </w:pPr>
+      <w:r>
+        <w:rPr>
+          <w:lang w:val="de"/>
+        </w:rPr>
+        <w:t xml:space="preserve">Eine Abrechnung, die formal fehlerfrei aussieht und einen falschen Schlüsselwert</w:t>
+      </w:r>
+      <w:r>
+        <w:rPr>
+          <w:lang w:val="de"/>
+        </w:rPr>
+        <w:t xml:space="preserve"> </w:t>
+      </w:r>
+      <w:r>
+        <w:rPr>
+          <w:lang w:val="de"/>
+        </w:rPr>
+        <w:t xml:space="preserve">enthält, wird angenommen, verarbeitet und zurückgewiesen — oft Wochen später.</w:t>
+      </w:r>
+      <w:r>
+        <w:rPr>
+          <w:lang w:val="de"/>
+        </w:rPr>
+        <w:t xml:space="preserve"> </w:t>
+      </w:r>
+      <w:r>
+        <w:rPr>
+          <w:b/>
+          <w:bCs/>
+          <w:lang w:val="de"/>
+        </w:rPr>
+        <w:t xml:space="preserve">Fehler in diesem Verfahren sind selten laut. Sie sind still und teuer.</w:t>
+      </w:r>
+    </w:p>
+    <w:p>
+      <w:pPr>
+        <w:pStyle w:val="BlockText"/>
+      </w:pPr>
+      <w:r>
+        <w:rPr>
+          <w:b/>
+          <w:bCs/>
+          <w:lang w:val="de"/>
+        </w:rPr>
+        <w:t xml:space="preserve">Der Leitgedanke des Projekts: nicht das Abrechnen ist schwer, sondern das</w:t>
+      </w:r>
+      <w:r>
+        <w:rPr>
+          <w:b/>
+          <w:bCs/>
+          <w:lang w:val="de"/>
+        </w:rPr>
+        <w:t xml:space="preserve"> </w:t>
+      </w:r>
+      <w:r>
+        <w:rPr>
+          <w:b/>
+          <w:bCs/>
+          <w:lang w:val="de"/>
+        </w:rPr>
+        <w:t xml:space="preserve">Richtigsein.</w:t>
+      </w:r>
+    </w:p>
+    <w:p>
+      <w:pPr>
+        <w:pStyle w:val="FirstParagraph"/>
+      </w:pPr>
+      <w:r>
+        <w:rPr>
+          <w:lang w:val="de"/>
+        </w:rPr>
+        <w:t xml:space="preserve">Daraus folgt die Festlegung, die den ganzen Aufbau prägt:</w:t>
+      </w:r>
+      <w:r>
+        <w:rPr>
+          <w:lang w:val="de"/>
+        </w:rPr>
+        <w:t xml:space="preserve"> </w:t>
+      </w:r>
+      <w:r>
+        <w:rPr>
+          <w:b/>
+          <w:bCs/>
+          <w:lang w:val="de"/>
+        </w:rPr>
+        <w:t xml:space="preserve">das Programm prüft,</w:t>
+      </w:r>
+      <w:r>
+        <w:rPr>
+          <w:b/>
+          <w:bCs/>
+          <w:lang w:val="de"/>
+        </w:rPr>
+        <w:t xml:space="preserve"> </w:t>
+      </w:r>
+      <w:r>
+        <w:rPr>
+          <w:b/>
+          <w:bCs/>
+          <w:lang w:val="de"/>
+        </w:rPr>
+        <w:t xml:space="preserve">bevor etwas das Haus verlässt</w:t>
+      </w:r>
+      <w:r>
+        <w:rPr>
+          <w:lang w:val="de"/>
+        </w:rPr>
+        <w:t xml:space="preserve"> </w:t>
+      </w:r>
+      <w:r>
+        <w:rPr>
+          <w:lang w:val="de"/>
+        </w:rPr>
+        <w:t xml:space="preserve">— nicht als Zusatzfunktion, sondern als Tor, an</w:t>
+      </w:r>
+      <w:r>
+        <w:rPr>
+          <w:lang w:val="de"/>
+        </w:rPr>
+        <w:t xml:space="preserve"> </w:t>
+      </w:r>
+      <w:r>
+        <w:rPr>
+          <w:lang w:val="de"/>
+        </w:rPr>
+        <w:t xml:space="preserve">dem jede Lieferung vorbeimuss.</w:t>
+      </w:r>
+    </w:p>
+    <w:bookmarkEnd w:id="14"/>
+    <w:bookmarkStart w:id="15" w:name="wie-weit-soll-es-tragen"/>
+    <w:p>
+      <w:pPr>
+        <w:pStyle w:val="Heading3"/>
+      </w:pPr>
+      <w:r>
+        <w:rPr>
+          <w:lang w:val="de"/>
+        </w:rPr>
+        <w:t xml:space="preserve">Wie weit soll es tragen</w:t>
+      </w:r>
+    </w:p>
+    <w:p>
+      <w:pPr>
+        <w:pStyle w:val="FirstParagraph"/>
+      </w:pPr>
+      <w:r>
+        <w:rPr>
+          <w:lang w:val="de"/>
+        </w:rPr>
+        <w:t xml:space="preserve">Man könnte das Programm auf Hebammenkurse zuschneiden. Das wäre die kleinere</w:t>
+      </w:r>
+      <w:r>
+        <w:rPr>
+          <w:lang w:val="de"/>
+        </w:rPr>
+        <w:t xml:space="preserve"> </w:t>
+      </w:r>
+      <w:r>
+        <w:rPr>
+          <w:lang w:val="de"/>
+        </w:rPr>
+        <w:t xml:space="preserve">Aufgabe und für den ersten Fall vollkommen ausreichend.</w:t>
+      </w:r>
+    </w:p>
+    <w:p>
+      <w:pPr>
+        <w:pStyle w:val="BodyText"/>
+      </w:pPr>
+      <w:r>
+        <w:rPr>
+          <w:lang w:val="de"/>
+        </w:rPr>
+        <w:t xml:space="preserve">Dagegen spricht ein Blick auf das Verfahren selbst:</w:t>
+      </w:r>
+      <w:r>
+        <w:rPr>
+          <w:lang w:val="de"/>
+        </w:rPr>
+        <w:t xml:space="preserve"> </w:t>
+      </w:r>
+      <w:r>
+        <w:rPr>
+          <w:b/>
+          <w:bCs/>
+          <w:lang w:val="de"/>
+        </w:rPr>
+        <w:t xml:space="preserve">fast alles daran ist nicht</w:t>
+      </w:r>
+      <w:r>
+        <w:rPr>
+          <w:b/>
+          <w:bCs/>
+          <w:lang w:val="de"/>
+        </w:rPr>
+        <w:t xml:space="preserve"> </w:t>
+      </w:r>
+      <w:r>
+        <w:rPr>
+          <w:b/>
+          <w:bCs/>
+          <w:lang w:val="de"/>
+        </w:rPr>
+        <w:t xml:space="preserve">leistungsspezifisch.</w:t>
       </w:r>
     </w:p>
     <w:tbl>
@@ -2838,21 +2147,21 @@
               <w:rPr>
                 <w:lang w:val="de"/>
               </w:rPr>
-              <w:t xml:space="preserve">Station</w:t>
-            </w:r>
-          </w:p>
-        </w:tc>
-        <w:tc>
-          <w:tcPr/>
-          <w:p>
-            <w:pPr>
-              <w:pStyle w:val="Compact"/>
-            </w:pPr>
-            <w:r>
-              <w:rPr>
-                <w:lang w:val="de"/>
-              </w:rPr>
-              <w:t xml:space="preserve">Was dort geschieht</w:t>
+              <w:t xml:space="preserve">Bleibt über die Leistungsbereiche gleich</w:t>
+            </w:r>
+          </w:p>
+        </w:tc>
+        <w:tc>
+          <w:tcPr/>
+          <w:p>
+            <w:pPr>
+              <w:pStyle w:val="Compact"/>
+            </w:pPr>
+            <w:r>
+              <w:rPr>
+                <w:lang w:val="de"/>
+              </w:rPr>
+              <w:t xml:space="preserve">Wechselt je Leistungsbereich</w:t>
             </w:r>
           </w:p>
         </w:tc>
@@ -2866,25 +2175,352 @@
             </w:pPr>
             <w:r>
               <w:rPr>
+                <w:lang w:val="de"/>
+              </w:rPr>
+              <w:t xml:space="preserve">Der Aufbau der Nachricht — Rahmen, Rechnungs-, Versicherten-, Leistungs- und Summenteile</w:t>
+            </w:r>
+          </w:p>
+        </w:tc>
+        <w:tc>
+          <w:tcPr/>
+          <w:p>
+            <w:pPr>
+              <w:pStyle w:val="Compact"/>
+            </w:pPr>
+            <w:r>
+              <w:rPr>
+                <w:lang w:val="de"/>
+              </w:rPr>
+              <w:t xml:space="preserve">Der Sammelgruppenschlüssel im Nachrichtenkopf</w:t>
+            </w:r>
+          </w:p>
+        </w:tc>
+      </w:tr>
+      <w:tr>
+        <w:tc>
+          <w:tcPr/>
+          <w:p>
+            <w:pPr>
+              <w:pStyle w:val="Compact"/>
+            </w:pPr>
+            <w:r>
+              <w:rPr>
+                <w:lang w:val="de"/>
+              </w:rPr>
+              <w:t xml:space="preserve">Die Beteiligten und ihre Institutionskennzeichen samt Prüfziffer</w:t>
+            </w:r>
+          </w:p>
+        </w:tc>
+        <w:tc>
+          <w:tcPr/>
+          <w:p>
+            <w:pPr>
+              <w:pStyle w:val="Compact"/>
+            </w:pPr>
+            <w:r>
+              <w:rPr>
+                <w:lang w:val="de"/>
+              </w:rPr>
+              <w:t xml:space="preserve">Der Abrechnungscode</w:t>
+            </w:r>
+          </w:p>
+        </w:tc>
+      </w:tr>
+      <w:tr>
+        <w:tc>
+          <w:tcPr/>
+          <w:p>
+            <w:pPr>
+              <w:pStyle w:val="Compact"/>
+            </w:pPr>
+            <w:r>
+              <w:rPr>
+                <w:lang w:val="de"/>
+              </w:rPr>
+              <w:t xml:space="preserve">Prüfung, Zählerführung, Summenbildung</w:t>
+            </w:r>
+          </w:p>
+        </w:tc>
+        <w:tc>
+          <w:tcPr/>
+          <w:p>
+            <w:pPr>
+              <w:pStyle w:val="Compact"/>
+            </w:pPr>
+            <w:r>
+              <w:rPr>
+                <w:lang w:val="de"/>
+              </w:rPr>
+              <w:t xml:space="preserve">Positionsnummern und Tarifkennzeichen</w:t>
+            </w:r>
+          </w:p>
+        </w:tc>
+      </w:tr>
+      <w:tr>
+        <w:tc>
+          <w:tcPr/>
+          <w:p>
+            <w:pPr>
+              <w:pStyle w:val="Compact"/>
+            </w:pPr>
+            <w:r>
+              <w:rPr>
+                <w:lang w:val="de"/>
+              </w:rPr>
+              <w:t xml:space="preserve">Lieferung, Zustellweg, Einordnung der Rückmeldung</w:t>
+            </w:r>
+          </w:p>
+        </w:tc>
+        <w:tc>
+          <w:tcPr/>
+          <w:p>
+            <w:pPr>
+              <w:pStyle w:val="Compact"/>
+            </w:pPr>
+            <w:r>
+              <w:rPr>
+                <w:lang w:val="de"/>
+              </w:rPr>
+              <w:t xml:space="preserve">Der Vertrag, aus dem sich die zulässigen Werte ergeben</w:t>
+            </w:r>
+          </w:p>
+        </w:tc>
+      </w:tr>
+    </w:tbl>
+    <w:p>
+      <w:pPr>
+        <w:pStyle w:val="BodyText"/>
+      </w:pPr>
+      <w:r>
+        <w:rPr>
+          <w:lang w:val="de"/>
+        </w:rPr>
+        <w:t xml:space="preserve">Die rechte Spalte ist kurz, und sie besteht ausschließlich aus</w:t>
+      </w:r>
+      <w:r>
+        <w:rPr>
+          <w:lang w:val="de"/>
+        </w:rPr>
+        <w:t xml:space="preserve"> </w:t>
+      </w:r>
+      <w:r>
+        <w:rPr>
+          <w:b/>
+          <w:bCs/>
+          <w:lang w:val="de"/>
+        </w:rPr>
+        <w:t xml:space="preserve">Werten</w:t>
+      </w:r>
+      <w:r>
+        <w:rPr>
+          <w:lang w:val="de"/>
+        </w:rPr>
+        <w:t xml:space="preserve">, nicht</w:t>
+      </w:r>
+      <w:r>
+        <w:rPr>
+          <w:lang w:val="de"/>
+        </w:rPr>
+        <w:t xml:space="preserve"> </w:t>
+      </w:r>
+      <w:r>
+        <w:rPr>
+          <w:lang w:val="de"/>
+        </w:rPr>
+        <w:t xml:space="preserve">aus Abläufen. Ein zweiter Leistungsbereich verlangt also Einträge, keinen Umbau</w:t>
+      </w:r>
+      <w:r>
+        <w:rPr>
+          <w:lang w:val="de"/>
+        </w:rPr>
+        <w:t xml:space="preserve"> </w:t>
+      </w:r>
+      <w:r>
+        <w:rPr>
+          <w:lang w:val="de"/>
+        </w:rPr>
+        <w:t xml:space="preserve">— vorausgesetzt, das Modell trennt beides von Anfang an.</w:t>
+      </w:r>
+    </w:p>
+    <w:p>
+      <w:pPr>
+        <w:pStyle w:val="BodyText"/>
+      </w:pPr>
+      <w:r>
+        <w:rPr>
+          <w:lang w:val="de"/>
+        </w:rPr>
+        <w:t xml:space="preserve">Genau das kostet in der Vision fast nichts und später sehr viel: ein Begriff,</w:t>
+      </w:r>
+      <w:r>
+        <w:rPr>
+          <w:lang w:val="de"/>
+        </w:rPr>
+        <w:t xml:space="preserve"> </w:t>
+      </w:r>
+      <w:r>
+        <w:rPr>
+          <w:lang w:val="de"/>
+        </w:rPr>
+        <w:t xml:space="preserve">der von Beginn an „Leistungsfall” heißt statt „Kurs”, trägt eine</w:t>
+      </w:r>
+      <w:r>
+        <w:rPr>
+          <w:lang w:val="de"/>
+        </w:rPr>
+        <w:t xml:space="preserve"> </w:t>
+      </w:r>
+      <w:r>
+        <w:rPr>
+          <w:lang w:val="de"/>
+        </w:rPr>
+        <w:t xml:space="preserve">Behandlungsserie mit, ohne dass jemand ihn umbenennen muss.</w:t>
+      </w:r>
+    </w:p>
+    <w:bookmarkEnd w:id="15"/>
+    <w:bookmarkStart w:id="16" w:name="wer-es-bedient"/>
+    <w:p>
+      <w:pPr>
+        <w:pStyle w:val="Heading3"/>
+      </w:pPr>
+      <w:r>
+        <w:rPr>
+          <w:lang w:val="de"/>
+        </w:rPr>
+        <w:t xml:space="preserve">Wer es bedient</w:t>
+      </w:r>
+    </w:p>
+    <w:p>
+      <w:pPr>
+        <w:pStyle w:val="FirstParagraph"/>
+      </w:pPr>
+      <w:r>
+        <w:rPr>
+          <w:lang w:val="de"/>
+        </w:rPr>
+        <w:t xml:space="preserve">Eine einzelne Person, an einem einzelnen Rechner, ohne besondere</w:t>
+      </w:r>
+      <w:r>
+        <w:rPr>
+          <w:lang w:val="de"/>
+        </w:rPr>
+        <w:t xml:space="preserve"> </w:t>
+      </w:r>
+      <w:r>
+        <w:rPr>
+          <w:lang w:val="de"/>
+        </w:rPr>
+        <w:t xml:space="preserve">Computerkenntnisse und ohne jemanden, der bei Problemen hilft. Meist abends,</w:t>
+      </w:r>
+      <w:r>
+        <w:rPr>
+          <w:lang w:val="de"/>
+        </w:rPr>
+        <w:t xml:space="preserve"> </w:t>
+      </w:r>
+      <w:r>
+        <w:rPr>
+          <w:lang w:val="de"/>
+        </w:rPr>
+        <w:t xml:space="preserve">nach der Arbeit.</w:t>
+      </w:r>
+    </w:p>
+    <w:tbl>
+      <w:tblPr>
+        <w:tblStyle w:val="Table"/>
+        <w:tblW w:type="pct" w:w="5000"/>
+        <w:tblLayout w:type="fixed"/>
+        <w:tblLook w:firstRow="1" w:lastRow="0" w:firstColumn="0" w:lastColumn="0" w:noHBand="0" w:noVBand="0" w:val="0020"/>
+      </w:tblPr>
+      <w:tblGrid>
+        <w:gridCol w:w="3960"/>
+        <w:gridCol w:w="3960"/>
+      </w:tblGrid>
+      <w:tr>
+        <w:trPr>
+          <w:tblHeader w:val="on"/>
+        </w:trPr>
+        <w:tc>
+          <w:tcPr/>
+          <w:p>
+            <w:pPr>
+              <w:pStyle w:val="Compact"/>
+            </w:pPr>
+            <w:r>
+              <w:rPr>
+                <w:lang w:val="de"/>
+              </w:rPr>
+              <w:t xml:space="preserve">Umstand</w:t>
+            </w:r>
+          </w:p>
+        </w:tc>
+        <w:tc>
+          <w:tcPr/>
+          <w:p>
+            <w:pPr>
+              <w:pStyle w:val="Compact"/>
+            </w:pPr>
+            <w:r>
+              <w:rPr>
+                <w:lang w:val="de"/>
+              </w:rPr>
+              <w:t xml:space="preserve">Was daraus für das Programm folgt</w:t>
+            </w:r>
+          </w:p>
+        </w:tc>
+      </w:tr>
+      <w:tr>
+        <w:tc>
+          <w:tcPr/>
+          <w:p>
+            <w:pPr>
+              <w:pStyle w:val="Compact"/>
+            </w:pPr>
+            <w:r>
+              <w:rPr>
+                <w:lang w:val="de"/>
+              </w:rPr>
+              <w:t xml:space="preserve">Niemand richtet etwas ein</w:t>
+            </w:r>
+          </w:p>
+        </w:tc>
+        <w:tc>
+          <w:tcPr/>
+          <w:p>
+            <w:pPr>
+              <w:pStyle w:val="Compact"/>
+            </w:pPr>
+            <w:r>
+              <w:rPr>
+                <w:lang w:val="de"/>
+              </w:rPr>
+              <w:t xml:space="preserve">Es darf</w:t>
+            </w:r>
+            <w:r>
+              <w:rPr>
+                <w:lang w:val="de"/>
+              </w:rPr>
+              <w:t xml:space="preserve"> </w:t>
+            </w:r>
+            <w:r>
+              <w:rPr>
                 <w:b/>
                 <w:bCs/>
                 <w:lang w:val="de"/>
               </w:rPr>
-              <w:t xml:space="preserve">Leistungsdaten</w:t>
-            </w:r>
-          </w:p>
-        </w:tc>
-        <w:tc>
-          <w:tcPr/>
-          <w:p>
-            <w:pPr>
-              <w:pStyle w:val="Compact"/>
-            </w:pPr>
-            <w:r>
-              <w:rPr>
-                <w:lang w:val="de"/>
-              </w:rPr>
-              <w:t xml:space="preserve">liegen ohnehin vor — in Listen und Köpfen</w:t>
+              <w:t xml:space="preserve">nichts zusätzlich installiert</w:t>
+            </w:r>
+            <w:r>
+              <w:rPr>
+                <w:lang w:val="de"/>
+              </w:rPr>
+              <w:t xml:space="preserve"> </w:t>
+            </w:r>
+            <w:r>
+              <w:rPr>
+                <w:lang w:val="de"/>
+              </w:rPr>
+              <w:t xml:space="preserve">werden müssen — keine Datenbank, keine Laufzeitumgebung, kein Serverdienst</w:t>
             </w:r>
           </w:p>
         </w:tc>
@@ -2898,25 +2534,73 @@
             </w:pPr>
             <w:r>
               <w:rPr>
+                <w:lang w:val="de"/>
+              </w:rPr>
+              <w:t xml:space="preserve">Es geht um Gesundheitsdaten</w:t>
+            </w:r>
+          </w:p>
+        </w:tc>
+        <w:tc>
+          <w:tcPr/>
+          <w:p>
+            <w:pPr>
+              <w:pStyle w:val="Compact"/>
+            </w:pPr>
+            <w:r>
+              <w:rPr>
+                <w:lang w:val="de"/>
+              </w:rPr>
+              <w:t xml:space="preserve">Die Daten bleiben</w:t>
+            </w:r>
+            <w:r>
+              <w:rPr>
+                <w:lang w:val="de"/>
+              </w:rPr>
+              <w:t xml:space="preserve"> </w:t>
+            </w:r>
+            <w:r>
+              <w:rPr>
                 <w:b/>
                 <w:bCs/>
                 <w:lang w:val="de"/>
               </w:rPr>
-              <w:t xml:space="preserve">Das Programm</w:t>
-            </w:r>
-          </w:p>
-        </w:tc>
-        <w:tc>
-          <w:tcPr/>
-          <w:p>
-            <w:pPr>
-              <w:pStyle w:val="Compact"/>
-            </w:pPr>
-            <w:r>
-              <w:rPr>
-                <w:lang w:val="de"/>
-              </w:rPr>
-              <w:t xml:space="preserve">erzeugt daraus die Abrechnungsdatei</w:t>
+              <w:t xml:space="preserve">auf dem Rechner der Anwenderin</w:t>
+            </w:r>
+            <w:r>
+              <w:rPr>
+                <w:lang w:val="de"/>
+              </w:rPr>
+              <w:t xml:space="preserve">, nicht im Netz</w:t>
+            </w:r>
+          </w:p>
+        </w:tc>
+      </w:tr>
+      <w:tr>
+        <w:tc>
+          <w:tcPr/>
+          <w:p>
+            <w:pPr>
+              <w:pStyle w:val="Compact"/>
+            </w:pPr>
+            <w:r>
+              <w:rPr>
+                <w:lang w:val="de"/>
+              </w:rPr>
+              <w:t xml:space="preserve">Niemand hilft, wenn etwas klemmt</w:t>
+            </w:r>
+          </w:p>
+        </w:tc>
+        <w:tc>
+          <w:tcPr/>
+          <w:p>
+            <w:pPr>
+              <w:pStyle w:val="Compact"/>
+            </w:pPr>
+            <w:r>
+              <w:rPr>
+                <w:lang w:val="de"/>
+              </w:rPr>
+              <w:t xml:space="preserve">Eine Meldung sagt,</w:t>
             </w:r>
             <w:r>
               <w:rPr>
@@ -2930,7 +2614,19 @@
                 <w:bCs/>
                 <w:lang w:val="de"/>
               </w:rPr>
-              <w:t xml:space="preserve">und prüft sie, bevor sie das Haus verlässt</w:t>
+              <w:t xml:space="preserve">was zu tun ist</w:t>
+            </w:r>
+            <w:r>
+              <w:rPr>
+                <w:lang w:val="de"/>
+              </w:rPr>
+              <w:t xml:space="preserve"> </w:t>
+            </w:r>
+            <w:r>
+              <w:rPr>
+                <w:lang w:val="de"/>
+              </w:rPr>
+              <w:t xml:space="preserve">— nicht, was schiefging. „Feld 4 ungültig” hilft niemandem</w:t>
             </w:r>
           </w:p>
         </w:tc>
@@ -2944,32 +2640,1069 @@
             </w:pPr>
             <w:r>
               <w:rPr>
+                <w:lang w:val="de"/>
+              </w:rPr>
+              <w:t xml:space="preserve">Abends, nebenher</w:t>
+            </w:r>
+          </w:p>
+        </w:tc>
+        <w:tc>
+          <w:tcPr/>
+          <w:p>
+            <w:pPr>
+              <w:pStyle w:val="Compact"/>
+            </w:pPr>
+            <w:r>
+              <w:rPr>
+                <w:lang w:val="de"/>
+              </w:rPr>
+              <w:t xml:space="preserve">Der Weg von den erfassten Daten zur fertigen Datei muss kurz sein</w:t>
+            </w:r>
+          </w:p>
+        </w:tc>
+      </w:tr>
+    </w:tbl>
+    <w:bookmarkEnd w:id="16"/>
+    <w:bookmarkStart w:id="17" w:name="was-es-ausdrücklich-nicht-wird"/>
+    <w:p>
+      <w:pPr>
+        <w:pStyle w:val="Heading3"/>
+      </w:pPr>
+      <w:r>
+        <w:rPr>
+          <w:lang w:val="de"/>
+        </w:rPr>
+        <w:t xml:space="preserve">Was es ausdrücklich nicht wird</w:t>
+      </w:r>
+    </w:p>
+    <w:p>
+      <w:pPr>
+        <w:pStyle w:val="FirstParagraph"/>
+      </w:pPr>
+      <w:r>
+        <w:rPr>
+          <w:lang w:val="de"/>
+        </w:rPr>
+        <w:t xml:space="preserve">So wichtig wie die andere Liste — ein Projekt ohne Grenzen wird nie fertig.</w:t>
+      </w:r>
+    </w:p>
+    <w:tbl>
+      <w:tblPr>
+        <w:tblStyle w:val="Table"/>
+        <w:tblW w:type="pct" w:w="5000"/>
+        <w:tblLayout w:type="fixed"/>
+        <w:tblLook w:firstRow="1" w:lastRow="0" w:firstColumn="0" w:lastColumn="0" w:noHBand="0" w:noVBand="0" w:val="0020"/>
+      </w:tblPr>
+      <w:tblGrid>
+        <w:gridCol w:w="3960"/>
+        <w:gridCol w:w="3960"/>
+      </w:tblGrid>
+      <w:tr>
+        <w:trPr>
+          <w:tblHeader w:val="on"/>
+        </w:trPr>
+        <w:tc>
+          <w:tcPr/>
+          <w:p>
+            <w:pPr>
+              <w:pStyle w:val="Compact"/>
+            </w:pPr>
+            <w:r>
+              <w:rPr>
+                <w:lang w:val="de"/>
+              </w:rPr>
+              <w:t xml:space="preserve">Nicht</w:t>
+            </w:r>
+          </w:p>
+        </w:tc>
+        <w:tc>
+          <w:tcPr/>
+          <w:p>
+            <w:pPr>
+              <w:pStyle w:val="Compact"/>
+            </w:pPr>
+            <w:r>
+              <w:rPr>
+                <w:lang w:val="de"/>
+              </w:rPr>
+              <w:t xml:space="preserve">Warum</w:t>
+            </w:r>
+          </w:p>
+        </w:tc>
+      </w:tr>
+      <w:tr>
+        <w:tc>
+          <w:tcPr/>
+          <w:p>
+            <w:pPr>
+              <w:pStyle w:val="Compact"/>
+            </w:pPr>
+            <w:r>
+              <w:rPr>
+                <w:lang w:val="de"/>
+              </w:rPr>
+              <w:t xml:space="preserve">Kurs- und Terminverwaltung, Erinnerungen</w:t>
+            </w:r>
+          </w:p>
+        </w:tc>
+        <w:tc>
+          <w:tcPr/>
+          <w:p>
+            <w:pPr>
+              <w:pStyle w:val="Compact"/>
+            </w:pPr>
+            <w:r>
+              <w:rPr>
+                <w:lang w:val="de"/>
+              </w:rPr>
+              <w:t xml:space="preserve">ein eigenes Feld, und dafür gibt es Werkzeuge</w:t>
+            </w:r>
+          </w:p>
+        </w:tc>
+      </w:tr>
+      <w:tr>
+        <w:tc>
+          <w:tcPr/>
+          <w:p>
+            <w:pPr>
+              <w:pStyle w:val="Compact"/>
+            </w:pPr>
+            <w:r>
+              <w:rPr>
+                <w:lang w:val="de"/>
+              </w:rPr>
+              <w:t xml:space="preserve">Buchhaltung, Steuer, Einnahmenüberschussrechnung</w:t>
+            </w:r>
+          </w:p>
+        </w:tc>
+        <w:tc>
+          <w:tcPr/>
+          <w:p>
+            <w:pPr>
+              <w:pStyle w:val="Compact"/>
+            </w:pPr>
+            <w:r>
+              <w:rPr>
+                <w:lang w:val="de"/>
+              </w:rPr>
+              <w:t xml:space="preserve">ebenso, und mit eigenen Vorschriften</w:t>
+            </w:r>
+          </w:p>
+        </w:tc>
+      </w:tr>
+      <w:tr>
+        <w:tc>
+          <w:tcPr/>
+          <w:p>
+            <w:pPr>
+              <w:pStyle w:val="Compact"/>
+            </w:pPr>
+            <w:r>
+              <w:rPr>
+                <w:lang w:val="de"/>
+              </w:rPr>
+              <w:t xml:space="preserve">Privatabrechnung mit Selbstzahlern</w:t>
+            </w:r>
+          </w:p>
+        </w:tc>
+        <w:tc>
+          <w:tcPr/>
+          <w:p>
+            <w:pPr>
+              <w:pStyle w:val="Compact"/>
+            </w:pPr>
+            <w:r>
+              <w:rPr>
+                <w:lang w:val="de"/>
+              </w:rPr>
+              <w:t xml:space="preserve">ein anderes Verfahren mit anderen Regeln</w:t>
+            </w:r>
+          </w:p>
+        </w:tc>
+      </w:tr>
+      <w:tr>
+        <w:tc>
+          <w:tcPr/>
+          <w:p>
+            <w:pPr>
+              <w:pStyle w:val="Compact"/>
+            </w:pPr>
+            <w:r>
+              <w:rPr>
+                <w:lang w:val="de"/>
+              </w:rPr>
+              <w:t xml:space="preserve">Mehrbenutzerbetrieb, Praxisverwaltung</w:t>
+            </w:r>
+          </w:p>
+        </w:tc>
+        <w:tc>
+          <w:tcPr/>
+          <w:p>
+            <w:pPr>
+              <w:pStyle w:val="Compact"/>
+            </w:pPr>
+            <w:r>
+              <w:rPr>
+                <w:lang w:val="de"/>
+              </w:rPr>
+              <w:t xml:space="preserve">eine bewusste Grenze; die gewählte Datenhaltung lässt genau einen Schreiber zu</w:t>
+            </w:r>
+          </w:p>
+        </w:tc>
+      </w:tr>
+      <w:tr>
+        <w:tc>
+          <w:tcPr/>
+          <w:p>
+            <w:pPr>
+              <w:pStyle w:val="Compact"/>
+            </w:pPr>
+            <w:r>
+              <w:rPr>
+                <w:lang w:val="de"/>
+              </w:rPr>
+              <w:t xml:space="preserve">Ein mitgelieferter Katalog gültiger Positionsnummern je Bereich</w:t>
+            </w:r>
+          </w:p>
+        </w:tc>
+        <w:tc>
+          <w:tcPr/>
+          <w:p>
+            <w:pPr>
+              <w:pStyle w:val="Compact"/>
+            </w:pPr>
+            <w:r>
+              <w:rPr>
+                <w:lang w:val="de"/>
+              </w:rPr>
+              <w:t xml:space="preserve">die ergeben sich aus dem Vertrag. Das Programm hält den Rahmen bereit, die Werte trägt ein, wer den Vertrag hat</w:t>
+            </w:r>
+          </w:p>
+        </w:tc>
+      </w:tr>
+      <w:tr>
+        <w:tc>
+          <w:tcPr/>
+          <w:p>
+            <w:pPr>
+              <w:pStyle w:val="Compact"/>
+            </w:pPr>
+            <w:r>
+              <w:rPr>
+                <w:lang w:val="de"/>
+              </w:rPr>
+              <w:t xml:space="preserve">Fachliche Beratung, welche Leistung abrechenbar ist</w:t>
+            </w:r>
+          </w:p>
+        </w:tc>
+        <w:tc>
+          <w:tcPr/>
+          <w:p>
+            <w:pPr>
+              <w:pStyle w:val="Compact"/>
+            </w:pPr>
+            <w:r>
+              <w:rPr>
+                <w:lang w:val="de"/>
+              </w:rPr>
+              <w:t xml:space="preserve">das entscheidet ebenfalls der Vertrag, nicht ein Programm</w:t>
+            </w:r>
+          </w:p>
+        </w:tc>
+      </w:tr>
+    </w:tbl>
+    <w:bookmarkEnd w:id="17"/>
+    <w:bookmarkEnd w:id="18"/>
+    <w:bookmarkStart w:id="20" w:name="entscheidung"/>
+    <w:p>
+      <w:pPr>
+        <w:pStyle w:val="Heading2"/>
+      </w:pPr>
+      <w:r>
+        <w:rPr>
+          <w:lang w:val="de"/>
+        </w:rPr>
+        <w:t xml:space="preserve">Entscheidung</w:t>
+      </w:r>
+    </w:p>
+    <w:p>
+      <w:pPr>
+        <w:pStyle w:val="FirstParagraph"/>
+      </w:pPr>
+      <w:r>
+        <w:rPr>
+          <w:b/>
+          <w:bCs/>
+          <w:lang w:val="de"/>
+        </w:rPr>
+        <w:t xml:space="preserve">Das Projekt wird ein Einzelplatzprogramm, das aus vorhandenen Leistungsdaten</w:t>
+      </w:r>
+      <w:r>
+        <w:rPr>
+          <w:b/>
+          <w:bCs/>
+          <w:lang w:val="de"/>
+        </w:rPr>
+        <w:t xml:space="preserve"> </w:t>
+      </w:r>
+      <w:r>
+        <w:rPr>
+          <w:b/>
+          <w:bCs/>
+          <w:lang w:val="de"/>
+        </w:rPr>
+        <w:t xml:space="preserve">eine prüffähige Abrechnungsdatei erzeugt — und das jede Datei prüft, bevor sie</w:t>
+      </w:r>
+      <w:r>
+        <w:rPr>
+          <w:b/>
+          <w:bCs/>
+          <w:lang w:val="de"/>
+        </w:rPr>
+        <w:t xml:space="preserve"> </w:t>
+      </w:r>
+      <w:r>
+        <w:rPr>
+          <w:b/>
+          <w:bCs/>
+          <w:lang w:val="de"/>
+        </w:rPr>
+        <w:t xml:space="preserve">hinausgeht.</w:t>
+      </w:r>
+      <w:r>
+        <w:rPr>
+          <w:lang w:val="de"/>
+        </w:rPr>
+        <w:t xml:space="preserve"> </w:t>
+      </w:r>
+      <w:r>
+        <w:rPr>
+          <w:lang w:val="de"/>
+        </w:rPr>
+        <w:t xml:space="preserve">Der Aufbau folgt dem Verfahren, nicht einem einzelnen</w:t>
+      </w:r>
+      <w:r>
+        <w:rPr>
+          <w:lang w:val="de"/>
+        </w:rPr>
+        <w:t xml:space="preserve"> </w:t>
+      </w:r>
+      <w:r>
+        <w:rPr>
+          <w:lang w:val="de"/>
+        </w:rPr>
+        <w:t xml:space="preserve">Leistungsbereich; der erste bediente ist die Hebammenhilfe.</w:t>
+      </w:r>
+    </w:p>
+    <w:p>
+      <w:pPr>
+        <w:pStyle w:val="BodyText"/>
+      </w:pPr>
+      <w:r>
+        <w:rPr>
+          <w:lang w:val="de"/>
+        </w:rPr>
+        <w:t xml:space="preserve">Von den sieben Punkten der Vision werden damit</w:t>
+      </w:r>
+      <w:r>
+        <w:rPr>
+          <w:lang w:val="de"/>
+        </w:rPr>
+        <w:t xml:space="preserve"> </w:t>
+      </w:r>
+      <w:r>
+        <w:rPr>
+          <w:b/>
+          <w:bCs/>
+          <w:lang w:val="de"/>
+        </w:rPr>
+        <w:t xml:space="preserve">die ersten fünf zum Bauauftrag</w:t>
+      </w:r>
+      <w:r>
+        <w:rPr>
+          <w:lang w:val="de"/>
+        </w:rPr>
+        <w:t xml:space="preserve"> </w:t>
+      </w:r>
+      <w:r>
+        <w:rPr>
+          <w:lang w:val="de"/>
+        </w:rPr>
+        <w:t xml:space="preserve">— gegliedert in fünf Kernfähigkeiten. Die Punkte 6 und 7, Nachbearbeitung einer</w:t>
+      </w:r>
+      <w:r>
+        <w:rPr>
+          <w:lang w:val="de"/>
+        </w:rPr>
+        <w:t xml:space="preserve"> </w:t>
+      </w:r>
+      <w:r>
+        <w:rPr>
+          <w:lang w:val="de"/>
+        </w:rPr>
+        <w:t xml:space="preserve">Zurückweisung und ein weiterer Leistungsbereich, bleiben Ziel, aber nicht</w:t>
+      </w:r>
+      <w:r>
+        <w:rPr>
+          <w:lang w:val="de"/>
+        </w:rPr>
+        <w:t xml:space="preserve"> </w:t>
+      </w:r>
+      <w:r>
+        <w:rPr>
+          <w:lang w:val="de"/>
+        </w:rPr>
+        <w:t xml:space="preserve">Gegenstand des ersten Durchgangs.</w:t>
+      </w:r>
+    </w:p>
+    <w:tbl>
+      <w:tblPr>
+        <w:tblStyle w:val="Table"/>
+        <w:tblW w:type="pct" w:w="5000"/>
+        <w:tblLayout w:type="fixed"/>
+        <w:tblLook w:firstRow="1" w:lastRow="0" w:firstColumn="0" w:lastColumn="0" w:noHBand="0" w:noVBand="0" w:val="0020"/>
+      </w:tblPr>
+      <w:tblGrid>
+        <w:gridCol w:w="2640"/>
+        <w:gridCol w:w="2640"/>
+        <w:gridCol w:w="2640"/>
+      </w:tblGrid>
+      <w:tr>
+        <w:trPr>
+          <w:tblHeader w:val="on"/>
+        </w:trPr>
+        <w:tc>
+          <w:tcPr/>
+          <w:p>
+            <w:pPr>
+              <w:pStyle w:val="Compact"/>
+            </w:pPr>
+            <w:r>
+              <w:rPr>
+                <w:lang w:val="de"/>
+              </w:rPr>
+              <w:t xml:space="preserve">#</w:t>
+            </w:r>
+          </w:p>
+        </w:tc>
+        <w:tc>
+          <w:tcPr/>
+          <w:p>
+            <w:pPr>
+              <w:pStyle w:val="Compact"/>
+            </w:pPr>
+            <w:r>
+              <w:rPr>
+                <w:lang w:val="de"/>
+              </w:rPr>
+              <w:t xml:space="preserve">Kernfähigkeit</w:t>
+            </w:r>
+          </w:p>
+        </w:tc>
+        <w:tc>
+          <w:tcPr/>
+          <w:p>
+            <w:pPr>
+              <w:pStyle w:val="Compact"/>
+            </w:pPr>
+            <w:r>
+              <w:rPr>
+                <w:lang w:val="de"/>
+              </w:rPr>
+              <w:t xml:space="preserve">Was dahintersteckt</w:t>
+            </w:r>
+          </w:p>
+        </w:tc>
+      </w:tr>
+      <w:tr>
+        <w:tc>
+          <w:tcPr/>
+          <w:p>
+            <w:pPr>
+              <w:pStyle w:val="Compact"/>
+            </w:pPr>
+            <w:r>
+              <w:rPr>
+                <w:lang w:val="de"/>
+              </w:rPr>
+              <w:t xml:space="preserve">1</w:t>
+            </w:r>
+          </w:p>
+        </w:tc>
+        <w:tc>
+          <w:tcPr/>
+          <w:p>
+            <w:pPr>
+              <w:pStyle w:val="Compact"/>
+            </w:pPr>
+            <w:r>
+              <w:rPr>
                 <w:b/>
                 <w:bCs/>
                 <w:lang w:val="de"/>
               </w:rPr>
-              <w:t xml:space="preserve">Die Krankenkasse</w:t>
-            </w:r>
-          </w:p>
-        </w:tc>
-        <w:tc>
-          <w:tcPr/>
-          <w:p>
-            <w:pPr>
-              <w:pStyle w:val="Compact"/>
-            </w:pPr>
-            <w:r>
-              <w:rPr>
-                <w:lang w:val="de"/>
-              </w:rPr>
-              <w:t xml:space="preserve">zahlt oder beanstandet</w:t>
+              <w:t xml:space="preserve">Stammdaten führen</w:t>
+            </w:r>
+          </w:p>
+        </w:tc>
+        <w:tc>
+          <w:tcPr/>
+          <w:p>
+            <w:pPr>
+              <w:pStyle w:val="Compact"/>
+            </w:pPr>
+            <w:r>
+              <w:rPr>
+                <w:lang w:val="de"/>
+              </w:rPr>
+              <w:t xml:space="preserve">versicherte Personen mit ihren Versicherungsangaben, die Leistungserbringerin selbst, Leistungsfälle als Zusammenfassung — ein Kurs, eine Behandlungsserie</w:t>
+            </w:r>
+          </w:p>
+        </w:tc>
+      </w:tr>
+      <w:tr>
+        <w:tc>
+          <w:tcPr/>
+          <w:p>
+            <w:pPr>
+              <w:pStyle w:val="Compact"/>
+            </w:pPr>
+            <w:r>
+              <w:rPr>
+                <w:lang w:val="de"/>
+              </w:rPr>
+              <w:t xml:space="preserve">2</w:t>
+            </w:r>
+          </w:p>
+        </w:tc>
+        <w:tc>
+          <w:tcPr/>
+          <w:p>
+            <w:pPr>
+              <w:pStyle w:val="Compact"/>
+            </w:pPr>
+            <w:r>
+              <w:rPr>
+                <w:b/>
+                <w:bCs/>
+                <w:lang w:val="de"/>
+              </w:rPr>
+              <w:t xml:space="preserve">Leistungen beschreiben</w:t>
+            </w:r>
+          </w:p>
+        </w:tc>
+        <w:tc>
+          <w:tcPr/>
+          <w:p>
+            <w:pPr>
+              <w:pStyle w:val="Compact"/>
+            </w:pPr>
+            <w:r>
+              <w:rPr>
+                <w:lang w:val="de"/>
+              </w:rPr>
+              <w:t xml:space="preserve">was eine Einheit kostet, unter welcher Position sie abgerechnet wird — einmal festgelegt, mehrfach verwendet. Hier sitzt das Bereichsspezifische</w:t>
+            </w:r>
+          </w:p>
+        </w:tc>
+      </w:tr>
+      <w:tr>
+        <w:tc>
+          <w:tcPr/>
+          <w:p>
+            <w:pPr>
+              <w:pStyle w:val="Compact"/>
+            </w:pPr>
+            <w:r>
+              <w:rPr>
+                <w:lang w:val="de"/>
+              </w:rPr>
+              <w:t xml:space="preserve">3</w:t>
+            </w:r>
+          </w:p>
+        </w:tc>
+        <w:tc>
+          <w:tcPr/>
+          <w:p>
+            <w:pPr>
+              <w:pStyle w:val="Compact"/>
+            </w:pPr>
+            <w:r>
+              <w:rPr>
+                <w:b/>
+                <w:bCs/>
+                <w:lang w:val="de"/>
+              </w:rPr>
+              <w:t xml:space="preserve">Abrechnung erzeugen</w:t>
+            </w:r>
+          </w:p>
+        </w:tc>
+        <w:tc>
+          <w:tcPr/>
+          <w:p>
+            <w:pPr>
+              <w:pStyle w:val="Compact"/>
+            </w:pPr>
+            <w:r>
+              <w:rPr>
+                <w:lang w:val="de"/>
+              </w:rPr>
+              <w:t xml:space="preserve">aus Leistungsfall, Beschreibung und Anzahl der Einheiten entsteht die Nachricht im vorgeschriebenen Format</w:t>
+            </w:r>
+          </w:p>
+        </w:tc>
+      </w:tr>
+      <w:tr>
+        <w:tc>
+          <w:tcPr/>
+          <w:p>
+            <w:pPr>
+              <w:pStyle w:val="Compact"/>
+            </w:pPr>
+            <w:r>
+              <w:rPr>
+                <w:lang w:val="de"/>
+              </w:rPr>
+              <w:t xml:space="preserve">4</w:t>
+            </w:r>
+          </w:p>
+        </w:tc>
+        <w:tc>
+          <w:tcPr/>
+          <w:p>
+            <w:pPr>
+              <w:pStyle w:val="Compact"/>
+            </w:pPr>
+            <w:r>
+              <w:rPr>
+                <w:b/>
+                <w:bCs/>
+                <w:lang w:val="de"/>
+              </w:rPr>
+              <w:t xml:space="preserve">Prüfen</w:t>
+            </w:r>
+          </w:p>
+        </w:tc>
+        <w:tc>
+          <w:tcPr/>
+          <w:p>
+            <w:pPr>
+              <w:pStyle w:val="Compact"/>
+            </w:pPr>
+            <w:r>
+              <w:rPr>
+                <w:lang w:val="de"/>
+              </w:rPr>
+              <w:t xml:space="preserve">Aufbau, Zähler, Summen, Pflichtangaben — ein Fehler hält den gesamten Lauf auf</w:t>
+            </w:r>
+          </w:p>
+        </w:tc>
+      </w:tr>
+      <w:tr>
+        <w:tc>
+          <w:tcPr/>
+          <w:p>
+            <w:pPr>
+              <w:pStyle w:val="Compact"/>
+            </w:pPr>
+            <w:r>
+              <w:rPr>
+                <w:lang w:val="de"/>
+              </w:rPr>
+              <w:t xml:space="preserve">5</w:t>
+            </w:r>
+          </w:p>
+        </w:tc>
+        <w:tc>
+          <w:tcPr/>
+          <w:p>
+            <w:pPr>
+              <w:pStyle w:val="Compact"/>
+            </w:pPr>
+            <w:r>
+              <w:rPr>
+                <w:b/>
+                <w:bCs/>
+                <w:lang w:val="de"/>
+              </w:rPr>
+              <w:t xml:space="preserve">Zustellen und einordnen</w:t>
+            </w:r>
+          </w:p>
+        </w:tc>
+        <w:tc>
+          <w:tcPr/>
+          <w:p>
+            <w:pPr>
+              <w:pStyle w:val="Compact"/>
+            </w:pPr>
+            <w:r>
+              <w:rPr>
+                <w:lang w:val="de"/>
+              </w:rPr>
+              <w:t xml:space="preserve">die Datei an den richtigen Empfänger, und die Antwort verständlich machen</w:t>
             </w:r>
           </w:p>
         </w:tc>
       </w:tr>
     </w:tbl>
+    <w:bookmarkStart w:id="19" w:name="warum-nicht-der-einfachere-weg"/>
+    <w:p>
+      <w:pPr>
+        <w:pStyle w:val="Heading3"/>
+      </w:pPr>
+      <w:r>
+        <w:rPr>
+          <w:lang w:val="de"/>
+        </w:rPr>
+        <w:t xml:space="preserve">Warum nicht der einfachere Weg</w:t>
+      </w:r>
+    </w:p>
+    <w:p>
+      <w:pPr>
+        <w:pStyle w:val="FirstParagraph"/>
+      </w:pPr>
+      <w:r>
+        <w:rPr>
+          <w:lang w:val="de"/>
+        </w:rPr>
+        <w:t xml:space="preserve">Man könnte auf Nummer 4 verzichten und darauf setzen, dass die Empfängerseite</w:t>
+      </w:r>
+      <w:r>
+        <w:rPr>
+          <w:lang w:val="de"/>
+        </w:rPr>
+        <w:t xml:space="preserve"> </w:t>
+      </w:r>
+      <w:r>
+        <w:rPr>
+          <w:lang w:val="de"/>
+        </w:rPr>
+        <w:t xml:space="preserve">schon meckern wird — das wäre erheblich weniger Arbeit. Dagegen steht der Preis</w:t>
+      </w:r>
+      <w:r>
+        <w:rPr>
+          <w:lang w:val="de"/>
+        </w:rPr>
+        <w:t xml:space="preserve"> </w:t>
+      </w:r>
+      <w:r>
+        <w:rPr>
+          <w:lang w:val="de"/>
+        </w:rPr>
+        <w:t xml:space="preserve">einer Beanstandung:</w:t>
+      </w:r>
+    </w:p>
+    <w:tbl>
+      <w:tblPr>
+        <w:tblStyle w:val="Table"/>
+        <w:tblW w:type="pct" w:w="5000"/>
+        <w:tblLayout w:type="fixed"/>
+        <w:tblLook w:firstRow="1" w:lastRow="0" w:firstColumn="0" w:lastColumn="0" w:noHBand="0" w:noVBand="0" w:val="0020"/>
+      </w:tblPr>
+      <w:tblGrid>
+        <w:gridCol w:w="3960"/>
+        <w:gridCol w:w="3960"/>
+      </w:tblGrid>
+      <w:tr>
+        <w:trPr>
+          <w:tblHeader w:val="on"/>
+        </w:trPr>
+        <w:tc>
+          <w:tcPr/>
+          <w:p>
+            <w:pPr>
+              <w:pStyle w:val="Compact"/>
+            </w:pPr>
+            <w:r>
+              <w:rPr>
+                <w:lang w:val="de"/>
+              </w:rPr>
+              <w:t xml:space="preserve">Wo der Fehler auffällt</w:t>
+            </w:r>
+          </w:p>
+        </w:tc>
+        <w:tc>
+          <w:tcPr/>
+          <w:p>
+            <w:pPr>
+              <w:pStyle w:val="Compact"/>
+            </w:pPr>
+            <w:r>
+              <w:rPr>
+                <w:lang w:val="de"/>
+              </w:rPr>
+              <w:t xml:space="preserve">Was er kostet</w:t>
+            </w:r>
+          </w:p>
+        </w:tc>
+      </w:tr>
+      <w:tr>
+        <w:tc>
+          <w:tcPr/>
+          <w:p>
+            <w:pPr>
+              <w:pStyle w:val="Compact"/>
+            </w:pPr>
+            <w:r>
+              <w:rPr>
+                <w:lang w:val="de"/>
+              </w:rPr>
+              <w:t xml:space="preserve">im eigenen Programm, vor dem Versand</w:t>
+            </w:r>
+          </w:p>
+        </w:tc>
+        <w:tc>
+          <w:tcPr/>
+          <w:p>
+            <w:pPr>
+              <w:pStyle w:val="Compact"/>
+            </w:pPr>
+            <w:r>
+              <w:rPr>
+                <w:lang w:val="de"/>
+              </w:rPr>
+              <w:t xml:space="preserve">dreißig Sekunden</w:t>
+            </w:r>
+          </w:p>
+        </w:tc>
+      </w:tr>
+      <w:tr>
+        <w:tc>
+          <w:tcPr/>
+          <w:p>
+            <w:pPr>
+              <w:pStyle w:val="Compact"/>
+            </w:pPr>
+            <w:r>
+              <w:rPr>
+                <w:lang w:val="de"/>
+              </w:rPr>
+              <w:t xml:space="preserve">bei der Kasse, Wochen später</w:t>
+            </w:r>
+          </w:p>
+        </w:tc>
+        <w:tc>
+          <w:tcPr/>
+          <w:p>
+            <w:pPr>
+              <w:pStyle w:val="Compact"/>
+            </w:pPr>
+            <w:r>
+              <w:rPr>
+                <w:lang w:val="de"/>
+              </w:rPr>
+              <w:t xml:space="preserve">ein vollständiger Wiederholungsdurchlauf</w:t>
+            </w:r>
+          </w:p>
+        </w:tc>
+      </w:tr>
+    </w:tbl>
+    <w:p>
+      <w:pPr>
+        <w:pStyle w:val="BodyText"/>
+      </w:pPr>
+      <w:r>
+        <w:rPr>
+          <w:lang w:val="de"/>
+        </w:rPr>
+        <w:t xml:space="preserve">Ohne die Prüfung wäre das Programm ein Dateischreiber, und dafür lohnt der</w:t>
+      </w:r>
+      <w:r>
+        <w:rPr>
+          <w:lang w:val="de"/>
+        </w:rPr>
+        <w:t xml:space="preserve"> </w:t>
+      </w:r>
+      <w:r>
+        <w:rPr>
+          <w:lang w:val="de"/>
+        </w:rPr>
+        <w:t xml:space="preserve">Aufwand nicht.</w:t>
+      </w:r>
+    </w:p>
     <w:bookmarkEnd w:id="19"/>
-    <w:bookmarkStart w:id="23" w:name="womit-begonnen-wird"/>
+    <w:bookmarkEnd w:id="20"/>
+    <w:bookmarkStart w:id="31" w:name="ergebnis"/>
+    <w:p>
+      <w:pPr>
+        <w:pStyle w:val="Heading2"/>
+      </w:pPr>
+      <w:r>
+        <w:rPr>
+          <w:lang w:val="de"/>
+        </w:rPr>
+        <w:t xml:space="preserve">Ergebnis</w:t>
+      </w:r>
+    </w:p>
+    <w:bookmarkStart w:id="21" w:name="das-zielbild"/>
+    <w:p>
+      <w:pPr>
+        <w:pStyle w:val="Heading3"/>
+      </w:pPr>
+      <w:r>
+        <w:rPr>
+          <w:lang w:val="de"/>
+        </w:rPr>
+        <w:t xml:space="preserve">Das Zielbild</w:t>
+      </w:r>
+    </w:p>
+    <w:tbl>
+      <w:tblPr>
+        <w:tblStyle w:val="Table"/>
+        <w:tblW w:type="pct" w:w="5000"/>
+        <w:tblLayout w:type="fixed"/>
+        <w:tblLook w:firstRow="1" w:lastRow="0" w:firstColumn="0" w:lastColumn="0" w:noHBand="0" w:noVBand="0" w:val="0020"/>
+      </w:tblPr>
+      <w:tblGrid>
+        <w:gridCol w:w="3960"/>
+        <w:gridCol w:w="3960"/>
+      </w:tblGrid>
+      <w:tr>
+        <w:trPr>
+          <w:tblHeader w:val="on"/>
+        </w:trPr>
+        <w:tc>
+          <w:tcPr/>
+          <w:p>
+            <w:pPr>
+              <w:pStyle w:val="Compact"/>
+            </w:pPr>
+            <w:r>
+              <w:rPr>
+                <w:lang w:val="de"/>
+              </w:rPr>
+              <w:t xml:space="preserve">Station</w:t>
+            </w:r>
+          </w:p>
+        </w:tc>
+        <w:tc>
+          <w:tcPr/>
+          <w:p>
+            <w:pPr>
+              <w:pStyle w:val="Compact"/>
+            </w:pPr>
+            <w:r>
+              <w:rPr>
+                <w:lang w:val="de"/>
+              </w:rPr>
+              <w:t xml:space="preserve">Was dort geschieht</w:t>
+            </w:r>
+          </w:p>
+        </w:tc>
+      </w:tr>
+      <w:tr>
+        <w:tc>
+          <w:tcPr/>
+          <w:p>
+            <w:pPr>
+              <w:pStyle w:val="Compact"/>
+            </w:pPr>
+            <w:r>
+              <w:rPr>
+                <w:b/>
+                <w:bCs/>
+                <w:lang w:val="de"/>
+              </w:rPr>
+              <w:t xml:space="preserve">Leistungsdaten</w:t>
+            </w:r>
+          </w:p>
+        </w:tc>
+        <w:tc>
+          <w:tcPr/>
+          <w:p>
+            <w:pPr>
+              <w:pStyle w:val="Compact"/>
+            </w:pPr>
+            <w:r>
+              <w:rPr>
+                <w:lang w:val="de"/>
+              </w:rPr>
+              <w:t xml:space="preserve">liegen ohnehin vor — in Listen und Köpfen</w:t>
+            </w:r>
+          </w:p>
+        </w:tc>
+      </w:tr>
+      <w:tr>
+        <w:tc>
+          <w:tcPr/>
+          <w:p>
+            <w:pPr>
+              <w:pStyle w:val="Compact"/>
+            </w:pPr>
+            <w:r>
+              <w:rPr>
+                <w:b/>
+                <w:bCs/>
+                <w:lang w:val="de"/>
+              </w:rPr>
+              <w:t xml:space="preserve">Das Programm</w:t>
+            </w:r>
+          </w:p>
+        </w:tc>
+        <w:tc>
+          <w:tcPr/>
+          <w:p>
+            <w:pPr>
+              <w:pStyle w:val="Compact"/>
+            </w:pPr>
+            <w:r>
+              <w:rPr>
+                <w:lang w:val="de"/>
+              </w:rPr>
+              <w:t xml:space="preserve">erzeugt daraus die Abrechnungsdatei</w:t>
+            </w:r>
+            <w:r>
+              <w:rPr>
+                <w:lang w:val="de"/>
+              </w:rPr>
+              <w:t xml:space="preserve"> </w:t>
+            </w:r>
+            <w:r>
+              <w:rPr>
+                <w:b/>
+                <w:bCs/>
+                <w:lang w:val="de"/>
+              </w:rPr>
+              <w:t xml:space="preserve">und prüft sie, bevor sie das Haus verlässt</w:t>
+            </w:r>
+          </w:p>
+        </w:tc>
+      </w:tr>
+      <w:tr>
+        <w:tc>
+          <w:tcPr/>
+          <w:p>
+            <w:pPr>
+              <w:pStyle w:val="Compact"/>
+            </w:pPr>
+            <w:r>
+              <w:rPr>
+                <w:b/>
+                <w:bCs/>
+                <w:lang w:val="de"/>
+              </w:rPr>
+              <w:t xml:space="preserve">Die Krankenkasse</w:t>
+            </w:r>
+          </w:p>
+        </w:tc>
+        <w:tc>
+          <w:tcPr/>
+          <w:p>
+            <w:pPr>
+              <w:pStyle w:val="Compact"/>
+            </w:pPr>
+            <w:r>
+              <w:rPr>
+                <w:lang w:val="de"/>
+              </w:rPr>
+              <w:t xml:space="preserve">zahlt oder beanstandet</w:t>
+            </w:r>
+          </w:p>
+        </w:tc>
+      </w:tr>
+    </w:tbl>
+    <w:bookmarkEnd w:id="21"/>
+    <w:bookmarkStart w:id="25" w:name="womit-begonnen-wird"/>
     <w:p>
       <w:pPr>
         <w:pStyle w:val="Heading3"/>
@@ -3063,18 +3796,18 @@
           <wp:inline>
             <wp:extent cx="5334000" cy="3435546"/>
             <wp:effectExtent b="0" l="0" r="0" t="0"/>
-            <wp:docPr descr="Ausschnitt Nachrichtenerzeugung" title="" id="21" name="Picture"/>
+            <wp:docPr descr="Ausschnitt Nachrichtenerzeugung" title="" id="23" name="Picture"/>
             <a:graphic>
               <a:graphicData uri="http://schemas.openxmlformats.org/drawingml/2006/picture">
                 <pic:pic>
                   <pic:nvPicPr>
-                    <pic:cNvPr descr="../GKVTransmitter_Vision_Nachrichtenerzeugung.png" id="22" name="Picture"/>
+                    <pic:cNvPr descr="../GKVTransmitter_Vision_Nachrichtenerzeugung.png" id="24" name="Picture"/>
                     <pic:cNvPicPr>
                       <a:picLocks noChangeArrowheads="1" noChangeAspect="1"/>
                     </pic:cNvPicPr>
                   </pic:nvPicPr>
                   <pic:blipFill>
-                    <a:blip r:embed="rId20"/>
+                    <a:blip r:embed="rId22"/>
                     <a:stretch>
                       <a:fillRect/>
                     </a:stretch>
@@ -3510,23 +4243,35 @@
         <w:rPr>
           <w:lang w:val="de"/>
         </w:rPr>
-        <w:t xml:space="preserve">Das vollständige Klassenbild und das fachliche Übersichtsmodell folgen in Teil</w:t>
-      </w:r>
-      <w:r>
-        <w:rPr>
-          <w:lang w:val="de"/>
-        </w:rPr>
-        <w:t xml:space="preserve"> </w:t>
-      </w:r>
-      <w:r>
-        <w:rPr>
-          <w:lang w:val="de"/>
-        </w:rPr>
-        <w:t xml:space="preserve">06, wenn genug entschieden ist, um sie zu verantworten.</w:t>
-      </w:r>
-    </w:p>
-    <w:bookmarkEnd w:id="23"/>
-    <w:bookmarkStart w:id="27" w:name="was-dauerhaft-festgehalten-werden-muss"/>
+        <w:t xml:space="preserve">Das fachliche Übersichtsmodell — dieselbe Sache, aber vollständig und als</w:t>
+      </w:r>
+      <w:r>
+        <w:rPr>
+          <w:lang w:val="de"/>
+        </w:rPr>
+        <w:t xml:space="preserve"> </w:t>
+      </w:r>
+      <w:r>
+        <w:rPr>
+          <w:lang w:val="de"/>
+        </w:rPr>
+        <w:t xml:space="preserve">Begriffe statt als Klassen — folgt in Teil 02. Das vollständige Klassenbild</w:t>
+      </w:r>
+      <w:r>
+        <w:rPr>
+          <w:lang w:val="de"/>
+        </w:rPr>
+        <w:t xml:space="preserve"> </w:t>
+      </w:r>
+      <w:r>
+        <w:rPr>
+          <w:lang w:val="de"/>
+        </w:rPr>
+        <w:t xml:space="preserve">kommt in Teil 06, wenn genug entschieden ist, um es zu verantworten.</w:t>
+      </w:r>
+    </w:p>
+    <w:bookmarkEnd w:id="25"/>
+    <w:bookmarkStart w:id="29" w:name="was-dauerhaft-festgehalten-werden-muss"/>
     <w:p>
       <w:pPr>
         <w:pStyle w:val="Heading3"/>
@@ -3650,18 +4395,18 @@
           <wp:inline>
             <wp:extent cx="5334000" cy="5728387"/>
             <wp:effectExtent b="0" l="0" r="0" t="0"/>
-            <wp:docPr descr="Erstes Datenmodell" title="" id="25" name="Picture"/>
+            <wp:docPr descr="Erstes Datenmodell" title="" id="27" name="Picture"/>
             <a:graphic>
               <a:graphicData uri="http://schemas.openxmlformats.org/drawingml/2006/picture">
                 <pic:pic>
                   <pic:nvPicPr>
-                    <pic:cNvPr descr="../GKVTransmitter_Vision_ER.png" id="26" name="Picture"/>
+                    <pic:cNvPr descr="../GKVTransmitter_Vision_ER.png" id="28" name="Picture"/>
                     <pic:cNvPicPr>
                       <a:picLocks noChangeArrowheads="1" noChangeAspect="1"/>
                     </pic:cNvPicPr>
                   </pic:nvPicPr>
                   <pic:blipFill>
-                    <a:blip r:embed="rId24"/>
+                    <a:blip r:embed="rId26"/>
                     <a:stretch>
                       <a:fillRect/>
                     </a:stretch>
@@ -4247,8 +4992,8 @@
         <w:t xml:space="preserve">ein weiterer Leistungsbereich später ein Eintrag bleibt und kein Umbau wird.</w:t>
       </w:r>
     </w:p>
-    <w:bookmarkEnd w:id="27"/>
-    <w:bookmarkStart w:id="28" w:name="woran-sich-erfolg-messen-lässt"/>
+    <w:bookmarkEnd w:id="29"/>
+    <w:bookmarkStart w:id="30" w:name="woran-sich-erfolg-messen-lässt"/>
     <w:p>
       <w:pPr>
         <w:pStyle w:val="Heading3"/>
@@ -4466,9 +5211,9 @@
         </w:tc>
       </w:tr>
     </w:tbl>
-    <w:bookmarkEnd w:id="28"/>
-    <w:bookmarkEnd w:id="29"/>
-    <w:bookmarkStart w:id="30" w:name="offen-geblieben"/>
+    <w:bookmarkEnd w:id="30"/>
+    <w:bookmarkEnd w:id="31"/>
+    <w:bookmarkStart w:id="32" w:name="offen-geblieben"/>
     <w:p>
       <w:pPr>
         <w:pStyle w:val="Heading2"/>
@@ -4763,7 +5508,7 @@
         <w:t xml:space="preserve">interessante Stelle.</w:t>
       </w:r>
     </w:p>
-    <w:bookmarkEnd w:id="30"/>
+    <w:bookmarkEnd w:id="32"/>
     <w:sectPr>
       <w:footnotePr>
         <w:numRestart w:val="eachSect"/>

</xml_diff>